<commit_message>
Simplify report and workbook formatting
Remove all color, fills, the running header, the cover rule and note,
and the restated question text. Headings are now just the question
numbers. Numbers and wording of the answers are unchanged.

Co-Authored-By: Claude Opus 5.5 <noreply@anthropic.com>
Claude-Session: https://claude.ai/code/session_01ShG3KqQSYtUQ4UFSULXCgJ
</commit_message>
<xml_diff>
--- a/Walmart_Cost_of_Capital_Report.docx
+++ b/Walmart_Cost_of_Capital_Report.docx
@@ -5,11 +5,12 @@
     <w:p>
       <w:pPr>
         <w:keepLines/>
-        <w:spacing w:after="0" w:before="2600" w:line="276" w:lineRule="auto"/>
+        <w:spacing w:after="0" w:before="3600" w:line="276" w:lineRule="auto"/>
       </w:pPr>
       <w:r>
         <w:rPr>
           <w:rFonts w:ascii="Arial" w:cs="Arial" w:eastAsia="Arial" w:hAnsi="Arial"/>
+          <w:color w:val="000000"/>
           <w:sz w:val="22"/>
           <w:szCs w:val="22"/>
         </w:rPr>
@@ -19,7 +20,7 @@
     <w:p>
       <w:pPr>
         <w:keepLines/>
-        <w:spacing w:after="240" w:before="0" w:line="300" w:lineRule="auto"/>
+        <w:spacing w:after="720" w:before="0" w:line="276" w:lineRule="auto"/>
         <w:jc w:val="center"/>
       </w:pPr>
       <w:r>
@@ -27,90 +28,27 @@
           <w:rFonts w:ascii="Arial" w:cs="Arial" w:eastAsia="Arial" w:hAnsi="Arial"/>
           <w:b/>
           <w:bCs/>
-          <w:color w:val="1F3864"/>
-          <w:sz w:val="56"/>
-          <w:szCs w:val="56"/>
-        </w:rPr>
-        <w:t xml:space="preserve">Estimating Walmart's</w:t>
-      </w:r>
-      <w:r>
-        <w:rPr>
-          <w:rFonts w:ascii="Arial" w:cs="Arial" w:eastAsia="Arial" w:hAnsi="Arial"/>
-          <w:b/>
-          <w:bCs/>
-          <w:color w:val="1F3864"/>
-          <w:sz w:val="56"/>
-          <w:szCs w:val="56"/>
-        </w:rPr>
-        <w:br/>
-        <w:t xml:space="preserve">Cost of Capital</w:t>
+          <w:color w:val="000000"/>
+          <w:sz w:val="40"/>
+          <w:szCs w:val="40"/>
+        </w:rPr>
+        <w:t xml:space="preserve">Estimating Walmart's Cost of Capital</w:t>
       </w:r>
     </w:p>
     <w:p>
       <w:pPr>
         <w:keepLines/>
-        <w:pBdr>
-          <w:bottom w:val="single" w:color="1F3864" w:sz="12" w:space="24"/>
-        </w:pBdr>
-        <w:spacing w:after="1200" w:before="0" w:line="276" w:lineRule="auto"/>
+        <w:spacing w:after="200" w:before="0" w:line="276" w:lineRule="auto"/>
         <w:jc w:val="center"/>
       </w:pPr>
       <w:r>
         <w:rPr>
           <w:rFonts w:ascii="Arial" w:cs="Arial" w:eastAsia="Arial" w:hAnsi="Arial"/>
-          <w:color w:val="595959"/>
-          <w:sz w:val="30"/>
-          <w:szCs w:val="30"/>
-        </w:rPr>
-        <w:t xml:space="preserve">Case Study Report</w:t>
-      </w:r>
-    </w:p>
-    <w:p>
-      <w:pPr>
-        <w:keepLines/>
-        <w:spacing w:after="80" w:before="0" w:line="276" w:lineRule="auto"/>
-        <w:jc w:val="center"/>
-      </w:pPr>
-      <w:r>
-        <w:rPr>
-          <w:rFonts w:ascii="Arial" w:cs="Arial" w:eastAsia="Arial" w:hAnsi="Arial"/>
-          <w:color w:val="595959"/>
-          <w:sz w:val="22"/>
-          <w:szCs w:val="22"/>
-        </w:rPr>
-        <w:t xml:space="preserve">Prepared by</w:t>
-      </w:r>
-    </w:p>
-    <w:p>
-      <w:pPr>
-        <w:keepLines/>
-        <w:spacing w:after="600" w:before="0" w:line="276" w:lineRule="auto"/>
-        <w:jc w:val="center"/>
-      </w:pPr>
-      <w:r>
-        <w:rPr>
-          <w:rFonts w:ascii="Arial" w:cs="Arial" w:eastAsia="Arial" w:hAnsi="Arial"/>
-          <w:b/>
-          <w:bCs/>
-          <w:sz w:val="32"/>
-          <w:szCs w:val="32"/>
+          <w:color w:val="000000"/>
+          <w:sz w:val="28"/>
+          <w:szCs w:val="28"/>
         </w:rPr>
         <w:t xml:space="preserve">Paolo Safady</w:t>
-      </w:r>
-    </w:p>
-    <w:p>
-      <w:pPr>
-        <w:keepLines/>
-        <w:spacing w:after="3600" w:before="0" w:line="276" w:lineRule="auto"/>
-        <w:jc w:val="center"/>
-      </w:pPr>
-      <w:r>
-        <w:rPr>
-          <w:rFonts w:ascii="Arial" w:cs="Arial" w:eastAsia="Arial" w:hAnsi="Arial"/>
-          <w:sz w:val="24"/>
-          <w:szCs w:val="24"/>
-        </w:rPr>
-        <w:t xml:space="preserve">October 21, 2026</w:t>
       </w:r>
     </w:p>
     <w:p>
@@ -122,27 +60,11 @@
       <w:r>
         <w:rPr>
           <w:rFonts w:ascii="Arial" w:cs="Arial" w:eastAsia="Arial" w:hAnsi="Arial"/>
-          <w:color w:val="595959"/>
-          <w:sz w:val="18"/>
-          <w:szCs w:val="18"/>
-        </w:rPr>
-        <w:t xml:space="preserve">Supporting tables and calculations are in the attached Excel workbook,</w:t>
-      </w:r>
-    </w:p>
-    <w:p>
-      <w:pPr>
-        <w:keepLines/>
-        <w:spacing w:after="0" w:before="0" w:line="276" w:lineRule="auto"/>
-        <w:jc w:val="center"/>
-      </w:pPr>
-      <w:r>
-        <w:rPr>
-          <w:rFonts w:ascii="Arial" w:cs="Arial" w:eastAsia="Arial" w:hAnsi="Arial"/>
-          <w:color w:val="595959"/>
-          <w:sz w:val="18"/>
-          <w:szCs w:val="18"/>
-        </w:rPr>
-        <w:t xml:space="preserve">Walmart_Cost_of_Capital_Data.xlsx.</w:t>
+          <w:color w:val="000000"/>
+          <w:sz w:val="24"/>
+          <w:szCs w:val="24"/>
+        </w:rPr>
+        <w:t xml:space="preserve">October 21, 2026</w:t>
       </w:r>
     </w:p>
     <w:p>
@@ -164,33 +86,11 @@
           <w:rFonts w:ascii="Arial" w:cs="Arial" w:eastAsia="Arial" w:hAnsi="Arial"/>
           <w:b/>
           <w:bCs/>
-          <w:color w:val="1F3864"/>
-          <w:sz w:val="28"/>
-          <w:szCs w:val="28"/>
-        </w:rPr>
-        <w:t xml:space="preserve">Question 1: What cost of capital is and why it matters</w:t>
-      </w:r>
-    </w:p>
-    <w:p>
-      <w:pPr>
-        <w:keepNext/>
-        <w:keepLines/>
-        <w:pBdr>
-          <w:left w:val="single" w:color="1F3864" w:sz="18" w:space="8"/>
-        </w:pBdr>
-        <w:spacing w:after="200" w:before="0" w:line="276" w:lineRule="auto"/>
-        <w:ind w:left="200"/>
-      </w:pPr>
-      <w:r>
-        <w:rPr>
-          <w:rFonts w:ascii="Arial" w:cs="Arial" w:eastAsia="Arial" w:hAnsi="Arial"/>
-          <w:i/>
-          <w:iCs/>
-          <w:color w:val="595959"/>
-          <w:sz w:val="20"/>
-          <w:szCs w:val="20"/>
-        </w:rPr>
-        <w:t xml:space="preserve">What is "Cost of Capital"? Why do Dale and Lee care about the cost of capital?</w:t>
+          <w:color w:val="000000"/>
+          <w:sz w:val="26"/>
+          <w:szCs w:val="26"/>
+        </w:rPr>
+        <w:t xml:space="preserve">Question 1</w:t>
       </w:r>
     </w:p>
     <w:p>
@@ -201,6 +101,7 @@
       <w:r>
         <w:rPr>
           <w:rFonts w:ascii="Arial" w:cs="Arial" w:eastAsia="Arial" w:hAnsi="Arial"/>
+          <w:color w:val="000000"/>
           <w:sz w:val="22"/>
           <w:szCs w:val="22"/>
         </w:rPr>
@@ -215,6 +116,7 @@
       <w:r>
         <w:rPr>
           <w:rFonts w:ascii="Arial" w:cs="Arial" w:eastAsia="Arial" w:hAnsi="Arial"/>
+          <w:color w:val="000000"/>
           <w:sz w:val="22"/>
           <w:szCs w:val="22"/>
         </w:rPr>
@@ -229,6 +131,7 @@
       <w:r>
         <w:rPr>
           <w:rFonts w:ascii="Arial" w:cs="Arial" w:eastAsia="Arial" w:hAnsi="Arial"/>
+          <w:color w:val="000000"/>
           <w:sz w:val="22"/>
           <w:szCs w:val="22"/>
         </w:rPr>
@@ -244,33 +147,11 @@
           <w:rFonts w:ascii="Arial" w:cs="Arial" w:eastAsia="Arial" w:hAnsi="Arial"/>
           <w:b/>
           <w:bCs/>
-          <w:color w:val="1F3864"/>
-          <w:sz w:val="28"/>
-          <w:szCs w:val="28"/>
-        </w:rPr>
-        <w:t xml:space="preserve">Question 2: Sources of financing</w:t>
-      </w:r>
-    </w:p>
-    <w:p>
-      <w:pPr>
-        <w:keepNext/>
-        <w:keepLines/>
-        <w:pBdr>
-          <w:left w:val="single" w:color="1F3864" w:sz="18" w:space="8"/>
-        </w:pBdr>
-        <w:spacing w:after="200" w:before="0" w:line="276" w:lineRule="auto"/>
-        <w:ind w:left="200"/>
-      </w:pPr>
-      <w:r>
-        <w:rPr>
-          <w:rFonts w:ascii="Arial" w:cs="Arial" w:eastAsia="Arial" w:hAnsi="Arial"/>
-          <w:i/>
-          <w:iCs/>
-          <w:color w:val="595959"/>
-          <w:sz w:val="20"/>
-          <w:szCs w:val="20"/>
-        </w:rPr>
-        <w:t xml:space="preserve">Create a table of all the sources of Financing for Walmart. Use the Balance Sheet that you are provided. You should be able to determine Long-term Debt, Short term debt, Sources of equity financing.</w:t>
+          <w:color w:val="000000"/>
+          <w:sz w:val="26"/>
+          <w:szCs w:val="26"/>
+        </w:rPr>
+        <w:t xml:space="preserve">Question 2</w:t>
       </w:r>
     </w:p>
     <w:p>
@@ -282,6 +163,7 @@
       <w:r>
         <w:rPr>
           <w:rFonts w:ascii="Arial" w:cs="Arial" w:eastAsia="Arial" w:hAnsi="Arial"/>
+          <w:color w:val="000000"/>
           <w:sz w:val="22"/>
           <w:szCs w:val="22"/>
         </w:rPr>
@@ -299,7 +181,7 @@
           <w:rFonts w:ascii="Arial" w:cs="Arial" w:eastAsia="Arial" w:hAnsi="Arial"/>
           <w:b/>
           <w:bCs/>
-          <w:color w:val="1F3864"/>
+          <w:color w:val="000000"/>
           <w:sz w:val="20"/>
           <w:szCs w:val="20"/>
         </w:rPr>
@@ -310,12 +192,12 @@
       <w:tblPr>
         <w:tblW w:type="dxa" w:w="9360"/>
         <w:tblBorders>
-          <w:top w:val="single" w:color="BFBFBF" w:sz="4"/>
-          <w:left w:val="single" w:color="BFBFBF" w:sz="4"/>
-          <w:bottom w:val="single" w:color="BFBFBF" w:sz="4"/>
-          <w:right w:val="single" w:color="BFBFBF" w:sz="4"/>
-          <w:insideH w:val="single" w:color="BFBFBF" w:sz="4"/>
-          <w:insideV w:val="single" w:color="BFBFBF" w:sz="4"/>
+          <w:top w:val="single" w:color="000000" w:sz="4"/>
+          <w:left w:val="single" w:color="000000" w:sz="4"/>
+          <w:bottom w:val="single" w:color="000000" w:sz="4"/>
+          <w:right w:val="single" w:color="000000" w:sz="4"/>
+          <w:insideH w:val="single" w:color="000000" w:sz="4"/>
+          <w:insideV w:val="single" w:color="000000" w:sz="4"/>
         </w:tblBorders>
         <w:tblLayout w:type="fixed"/>
       </w:tblPr>
@@ -332,7 +214,6 @@
         <w:tc>
           <w:tcPr>
             <w:tcW w:type="dxa" w:w="5560"/>
-            <w:shd w:fill="1F3864" w:color="auto" w:val="clear"/>
             <w:tcMar>
               <w:top w:type="dxa" w:w="60"/>
               <w:left w:type="dxa" w:w="110"/>
@@ -353,7 +234,7 @@
                 <w:rFonts w:ascii="Arial" w:cs="Arial" w:eastAsia="Arial" w:hAnsi="Arial"/>
                 <w:b/>
                 <w:bCs/>
-                <w:color w:val="FFFFFF"/>
+                <w:color w:val="000000"/>
                 <w:sz w:val="20"/>
                 <w:szCs w:val="20"/>
               </w:rPr>
@@ -364,7 +245,6 @@
         <w:tc>
           <w:tcPr>
             <w:tcW w:type="dxa" w:w="1900"/>
-            <w:shd w:fill="1F3864" w:color="auto" w:val="clear"/>
             <w:tcMar>
               <w:top w:type="dxa" w:w="60"/>
               <w:left w:type="dxa" w:w="110"/>
@@ -385,7 +265,7 @@
                 <w:rFonts w:ascii="Arial" w:cs="Arial" w:eastAsia="Arial" w:hAnsi="Arial"/>
                 <w:b/>
                 <w:bCs/>
-                <w:color w:val="FFFFFF"/>
+                <w:color w:val="000000"/>
                 <w:sz w:val="20"/>
                 <w:szCs w:val="20"/>
               </w:rPr>
@@ -396,7 +276,6 @@
         <w:tc>
           <w:tcPr>
             <w:tcW w:type="dxa" w:w="1900"/>
-            <w:shd w:fill="1F3864" w:color="auto" w:val="clear"/>
             <w:tcMar>
               <w:top w:type="dxa" w:w="60"/>
               <w:left w:type="dxa" w:w="110"/>
@@ -417,7 +296,7 @@
                 <w:rFonts w:ascii="Arial" w:cs="Arial" w:eastAsia="Arial" w:hAnsi="Arial"/>
                 <w:b/>
                 <w:bCs/>
-                <w:color w:val="FFFFFF"/>
+                <w:color w:val="000000"/>
                 <w:sz w:val="20"/>
                 <w:szCs w:val="20"/>
               </w:rPr>
@@ -434,7 +313,6 @@
           <w:tcPr>
             <w:tcW w:type="dxa" w:w="9360"/>
             <w:gridSpan w:val="3"/>
-            <w:shd w:fill="D9E1F2" w:color="auto" w:val="clear"/>
             <w:tcMar>
               <w:top w:type="dxa" w:w="60"/>
               <w:left w:type="dxa" w:w="110"/>
@@ -453,6 +331,7 @@
                 <w:rFonts w:ascii="Arial" w:cs="Arial" w:eastAsia="Arial" w:hAnsi="Arial"/>
                 <w:b/>
                 <w:bCs/>
+                <w:color w:val="000000"/>
                 <w:sz w:val="20"/>
                 <w:szCs w:val="20"/>
               </w:rPr>
@@ -488,6 +367,7 @@
             <w:r>
               <w:rPr>
                 <w:rFonts w:ascii="Arial" w:cs="Arial" w:eastAsia="Arial" w:hAnsi="Arial"/>
+                <w:color w:val="000000"/>
                 <w:sz w:val="20"/>
                 <w:szCs w:val="20"/>
               </w:rPr>
@@ -516,6 +396,7 @@
             <w:r>
               <w:rPr>
                 <w:rFonts w:ascii="Arial" w:cs="Arial" w:eastAsia="Arial" w:hAnsi="Arial"/>
+                <w:color w:val="000000"/>
                 <w:sz w:val="20"/>
                 <w:szCs w:val="20"/>
               </w:rPr>
@@ -544,6 +425,7 @@
             <w:r>
               <w:rPr>
                 <w:rFonts w:ascii="Arial" w:cs="Arial" w:eastAsia="Arial" w:hAnsi="Arial"/>
+                <w:color w:val="000000"/>
                 <w:sz w:val="20"/>
                 <w:szCs w:val="20"/>
               </w:rPr>
@@ -579,6 +461,7 @@
             <w:r>
               <w:rPr>
                 <w:rFonts w:ascii="Arial" w:cs="Arial" w:eastAsia="Arial" w:hAnsi="Arial"/>
+                <w:color w:val="000000"/>
                 <w:sz w:val="20"/>
                 <w:szCs w:val="20"/>
               </w:rPr>
@@ -607,6 +490,7 @@
             <w:r>
               <w:rPr>
                 <w:rFonts w:ascii="Arial" w:cs="Arial" w:eastAsia="Arial" w:hAnsi="Arial"/>
+                <w:color w:val="000000"/>
                 <w:sz w:val="20"/>
                 <w:szCs w:val="20"/>
               </w:rPr>
@@ -635,6 +519,7 @@
             <w:r>
               <w:rPr>
                 <w:rFonts w:ascii="Arial" w:cs="Arial" w:eastAsia="Arial" w:hAnsi="Arial"/>
+                <w:color w:val="000000"/>
                 <w:sz w:val="20"/>
                 <w:szCs w:val="20"/>
               </w:rPr>
@@ -670,6 +555,7 @@
             <w:r>
               <w:rPr>
                 <w:rFonts w:ascii="Arial" w:cs="Arial" w:eastAsia="Arial" w:hAnsi="Arial"/>
+                <w:color w:val="000000"/>
                 <w:sz w:val="20"/>
                 <w:szCs w:val="20"/>
               </w:rPr>
@@ -698,6 +584,7 @@
             <w:r>
               <w:rPr>
                 <w:rFonts w:ascii="Arial" w:cs="Arial" w:eastAsia="Arial" w:hAnsi="Arial"/>
+                <w:color w:val="000000"/>
                 <w:sz w:val="20"/>
                 <w:szCs w:val="20"/>
               </w:rPr>
@@ -726,6 +613,7 @@
             <w:r>
               <w:rPr>
                 <w:rFonts w:ascii="Arial" w:cs="Arial" w:eastAsia="Arial" w:hAnsi="Arial"/>
+                <w:color w:val="000000"/>
                 <w:sz w:val="20"/>
                 <w:szCs w:val="20"/>
               </w:rPr>
@@ -761,6 +649,7 @@
             <w:r>
               <w:rPr>
                 <w:rFonts w:ascii="Arial" w:cs="Arial" w:eastAsia="Arial" w:hAnsi="Arial"/>
+                <w:color w:val="000000"/>
                 <w:sz w:val="20"/>
                 <w:szCs w:val="20"/>
               </w:rPr>
@@ -789,6 +678,7 @@
             <w:r>
               <w:rPr>
                 <w:rFonts w:ascii="Arial" w:cs="Arial" w:eastAsia="Arial" w:hAnsi="Arial"/>
+                <w:color w:val="000000"/>
                 <w:sz w:val="20"/>
                 <w:szCs w:val="20"/>
               </w:rPr>
@@ -817,6 +707,7 @@
             <w:r>
               <w:rPr>
                 <w:rFonts w:ascii="Arial" w:cs="Arial" w:eastAsia="Arial" w:hAnsi="Arial"/>
+                <w:color w:val="000000"/>
                 <w:sz w:val="20"/>
                 <w:szCs w:val="20"/>
               </w:rPr>
@@ -852,6 +743,7 @@
             <w:r>
               <w:rPr>
                 <w:rFonts w:ascii="Arial" w:cs="Arial" w:eastAsia="Arial" w:hAnsi="Arial"/>
+                <w:color w:val="000000"/>
                 <w:sz w:val="20"/>
                 <w:szCs w:val="20"/>
               </w:rPr>
@@ -880,6 +772,7 @@
             <w:r>
               <w:rPr>
                 <w:rFonts w:ascii="Arial" w:cs="Arial" w:eastAsia="Arial" w:hAnsi="Arial"/>
+                <w:color w:val="000000"/>
                 <w:sz w:val="20"/>
                 <w:szCs w:val="20"/>
               </w:rPr>
@@ -908,6 +801,7 @@
             <w:r>
               <w:rPr>
                 <w:rFonts w:ascii="Arial" w:cs="Arial" w:eastAsia="Arial" w:hAnsi="Arial"/>
+                <w:color w:val="000000"/>
                 <w:sz w:val="20"/>
                 <w:szCs w:val="20"/>
               </w:rPr>
@@ -924,7 +818,6 @@
         <w:tc>
           <w:tcPr>
             <w:tcW w:type="dxa" w:w="5560"/>
-            <w:shd w:fill="F2F2F2" w:color="auto" w:val="clear"/>
             <w:tcMar>
               <w:top w:type="dxa" w:w="60"/>
               <w:left w:type="dxa" w:w="110"/>
@@ -945,6 +838,7 @@
                 <w:rFonts w:ascii="Arial" w:cs="Arial" w:eastAsia="Arial" w:hAnsi="Arial"/>
                 <w:b/>
                 <w:bCs/>
+                <w:color w:val="000000"/>
                 <w:sz w:val="20"/>
                 <w:szCs w:val="20"/>
               </w:rPr>
@@ -955,7 +849,6 @@
         <w:tc>
           <w:tcPr>
             <w:tcW w:type="dxa" w:w="1900"/>
-            <w:shd w:fill="F2F2F2" w:color="auto" w:val="clear"/>
             <w:tcMar>
               <w:top w:type="dxa" w:w="60"/>
               <w:left w:type="dxa" w:w="110"/>
@@ -976,6 +869,7 @@
                 <w:rFonts w:ascii="Arial" w:cs="Arial" w:eastAsia="Arial" w:hAnsi="Arial"/>
                 <w:b/>
                 <w:bCs/>
+                <w:color w:val="000000"/>
                 <w:sz w:val="20"/>
                 <w:szCs w:val="20"/>
               </w:rPr>
@@ -986,7 +880,6 @@
         <w:tc>
           <w:tcPr>
             <w:tcW w:type="dxa" w:w="1900"/>
-            <w:shd w:fill="F2F2F2" w:color="auto" w:val="clear"/>
             <w:tcMar>
               <w:top w:type="dxa" w:w="60"/>
               <w:left w:type="dxa" w:w="110"/>
@@ -1007,6 +900,7 @@
                 <w:rFonts w:ascii="Arial" w:cs="Arial" w:eastAsia="Arial" w:hAnsi="Arial"/>
                 <w:b/>
                 <w:bCs/>
+                <w:color w:val="000000"/>
                 <w:sz w:val="20"/>
                 <w:szCs w:val="20"/>
               </w:rPr>
@@ -1023,7 +917,6 @@
           <w:tcPr>
             <w:tcW w:type="dxa" w:w="9360"/>
             <w:gridSpan w:val="3"/>
-            <w:shd w:fill="D9E1F2" w:color="auto" w:val="clear"/>
             <w:tcMar>
               <w:top w:type="dxa" w:w="60"/>
               <w:left w:type="dxa" w:w="110"/>
@@ -1042,6 +935,7 @@
                 <w:rFonts w:ascii="Arial" w:cs="Arial" w:eastAsia="Arial" w:hAnsi="Arial"/>
                 <w:b/>
                 <w:bCs/>
+                <w:color w:val="000000"/>
                 <w:sz w:val="20"/>
                 <w:szCs w:val="20"/>
               </w:rPr>
@@ -1077,6 +971,7 @@
             <w:r>
               <w:rPr>
                 <w:rFonts w:ascii="Arial" w:cs="Arial" w:eastAsia="Arial" w:hAnsi="Arial"/>
+                <w:color w:val="000000"/>
                 <w:sz w:val="20"/>
                 <w:szCs w:val="20"/>
               </w:rPr>
@@ -1105,6 +1000,7 @@
             <w:r>
               <w:rPr>
                 <w:rFonts w:ascii="Arial" w:cs="Arial" w:eastAsia="Arial" w:hAnsi="Arial"/>
+                <w:color w:val="000000"/>
                 <w:sz w:val="20"/>
                 <w:szCs w:val="20"/>
               </w:rPr>
@@ -1133,6 +1029,7 @@
             <w:r>
               <w:rPr>
                 <w:rFonts w:ascii="Arial" w:cs="Arial" w:eastAsia="Arial" w:hAnsi="Arial"/>
+                <w:color w:val="000000"/>
                 <w:sz w:val="20"/>
                 <w:szCs w:val="20"/>
               </w:rPr>
@@ -1168,6 +1065,7 @@
             <w:r>
               <w:rPr>
                 <w:rFonts w:ascii="Arial" w:cs="Arial" w:eastAsia="Arial" w:hAnsi="Arial"/>
+                <w:color w:val="000000"/>
                 <w:sz w:val="20"/>
                 <w:szCs w:val="20"/>
               </w:rPr>
@@ -1196,6 +1094,7 @@
             <w:r>
               <w:rPr>
                 <w:rFonts w:ascii="Arial" w:cs="Arial" w:eastAsia="Arial" w:hAnsi="Arial"/>
+                <w:color w:val="000000"/>
                 <w:sz w:val="20"/>
                 <w:szCs w:val="20"/>
               </w:rPr>
@@ -1224,6 +1123,7 @@
             <w:r>
               <w:rPr>
                 <w:rFonts w:ascii="Arial" w:cs="Arial" w:eastAsia="Arial" w:hAnsi="Arial"/>
+                <w:color w:val="000000"/>
                 <w:sz w:val="20"/>
                 <w:szCs w:val="20"/>
               </w:rPr>
@@ -1240,7 +1140,6 @@
         <w:tc>
           <w:tcPr>
             <w:tcW w:type="dxa" w:w="5560"/>
-            <w:shd w:fill="F2F2F2" w:color="auto" w:val="clear"/>
             <w:tcMar>
               <w:top w:type="dxa" w:w="60"/>
               <w:left w:type="dxa" w:w="110"/>
@@ -1261,6 +1160,7 @@
                 <w:rFonts w:ascii="Arial" w:cs="Arial" w:eastAsia="Arial" w:hAnsi="Arial"/>
                 <w:b/>
                 <w:bCs/>
+                <w:color w:val="000000"/>
                 <w:sz w:val="20"/>
                 <w:szCs w:val="20"/>
               </w:rPr>
@@ -1271,7 +1171,6 @@
         <w:tc>
           <w:tcPr>
             <w:tcW w:type="dxa" w:w="1900"/>
-            <w:shd w:fill="F2F2F2" w:color="auto" w:val="clear"/>
             <w:tcMar>
               <w:top w:type="dxa" w:w="60"/>
               <w:left w:type="dxa" w:w="110"/>
@@ -1292,6 +1191,7 @@
                 <w:rFonts w:ascii="Arial" w:cs="Arial" w:eastAsia="Arial" w:hAnsi="Arial"/>
                 <w:b/>
                 <w:bCs/>
+                <w:color w:val="000000"/>
                 <w:sz w:val="20"/>
                 <w:szCs w:val="20"/>
               </w:rPr>
@@ -1302,7 +1202,6 @@
         <w:tc>
           <w:tcPr>
             <w:tcW w:type="dxa" w:w="1900"/>
-            <w:shd w:fill="F2F2F2" w:color="auto" w:val="clear"/>
             <w:tcMar>
               <w:top w:type="dxa" w:w="60"/>
               <w:left w:type="dxa" w:w="110"/>
@@ -1323,6 +1222,7 @@
                 <w:rFonts w:ascii="Arial" w:cs="Arial" w:eastAsia="Arial" w:hAnsi="Arial"/>
                 <w:b/>
                 <w:bCs/>
+                <w:color w:val="000000"/>
                 <w:sz w:val="20"/>
                 <w:szCs w:val="20"/>
               </w:rPr>
@@ -1339,7 +1239,6 @@
         <w:tc>
           <w:tcPr>
             <w:tcW w:type="dxa" w:w="5560"/>
-            <w:shd w:fill="FFF2CC" w:color="auto" w:val="clear"/>
             <w:tcMar>
               <w:top w:type="dxa" w:w="60"/>
               <w:left w:type="dxa" w:w="110"/>
@@ -1360,6 +1259,7 @@
                 <w:rFonts w:ascii="Arial" w:cs="Arial" w:eastAsia="Arial" w:hAnsi="Arial"/>
                 <w:b/>
                 <w:bCs/>
+                <w:color w:val="000000"/>
                 <w:sz w:val="20"/>
                 <w:szCs w:val="20"/>
               </w:rPr>
@@ -1370,7 +1270,6 @@
         <w:tc>
           <w:tcPr>
             <w:tcW w:type="dxa" w:w="1900"/>
-            <w:shd w:fill="FFF2CC" w:color="auto" w:val="clear"/>
             <w:tcMar>
               <w:top w:type="dxa" w:w="60"/>
               <w:left w:type="dxa" w:w="110"/>
@@ -1391,6 +1290,7 @@
                 <w:rFonts w:ascii="Arial" w:cs="Arial" w:eastAsia="Arial" w:hAnsi="Arial"/>
                 <w:b/>
                 <w:bCs/>
+                <w:color w:val="000000"/>
                 <w:sz w:val="20"/>
                 <w:szCs w:val="20"/>
               </w:rPr>
@@ -1401,7 +1301,6 @@
         <w:tc>
           <w:tcPr>
             <w:tcW w:type="dxa" w:w="1900"/>
-            <w:shd w:fill="FFF2CC" w:color="auto" w:val="clear"/>
             <w:tcMar>
               <w:top w:type="dxa" w:w="60"/>
               <w:left w:type="dxa" w:w="110"/>
@@ -1422,6 +1321,7 @@
                 <w:rFonts w:ascii="Arial" w:cs="Arial" w:eastAsia="Arial" w:hAnsi="Arial"/>
                 <w:b/>
                 <w:bCs/>
+                <w:color w:val="000000"/>
                 <w:sz w:val="20"/>
                 <w:szCs w:val="20"/>
               </w:rPr>
@@ -1438,7 +1338,6 @@
           <w:tcPr>
             <w:tcW w:type="dxa" w:w="9360"/>
             <w:gridSpan w:val="3"/>
-            <w:shd w:fill="D9E1F2" w:color="auto" w:val="clear"/>
             <w:tcMar>
               <w:top w:type="dxa" w:w="60"/>
               <w:left w:type="dxa" w:w="110"/>
@@ -1457,6 +1356,7 @@
                 <w:rFonts w:ascii="Arial" w:cs="Arial" w:eastAsia="Arial" w:hAnsi="Arial"/>
                 <w:b/>
                 <w:bCs/>
+                <w:color w:val="000000"/>
                 <w:sz w:val="20"/>
                 <w:szCs w:val="20"/>
               </w:rPr>
@@ -1492,6 +1392,7 @@
             <w:r>
               <w:rPr>
                 <w:rFonts w:ascii="Arial" w:cs="Arial" w:eastAsia="Arial" w:hAnsi="Arial"/>
+                <w:color w:val="000000"/>
                 <w:sz w:val="20"/>
                 <w:szCs w:val="20"/>
               </w:rPr>
@@ -1520,6 +1421,7 @@
             <w:r>
               <w:rPr>
                 <w:rFonts w:ascii="Arial" w:cs="Arial" w:eastAsia="Arial" w:hAnsi="Arial"/>
+                <w:color w:val="000000"/>
                 <w:sz w:val="20"/>
                 <w:szCs w:val="20"/>
               </w:rPr>
@@ -1548,6 +1450,7 @@
             <w:r>
               <w:rPr>
                 <w:rFonts w:ascii="Arial" w:cs="Arial" w:eastAsia="Arial" w:hAnsi="Arial"/>
+                <w:color w:val="000000"/>
                 <w:sz w:val="20"/>
                 <w:szCs w:val="20"/>
               </w:rPr>
@@ -1583,6 +1486,7 @@
             <w:r>
               <w:rPr>
                 <w:rFonts w:ascii="Arial" w:cs="Arial" w:eastAsia="Arial" w:hAnsi="Arial"/>
+                <w:color w:val="000000"/>
                 <w:sz w:val="20"/>
                 <w:szCs w:val="20"/>
               </w:rPr>
@@ -1611,6 +1515,7 @@
             <w:r>
               <w:rPr>
                 <w:rFonts w:ascii="Arial" w:cs="Arial" w:eastAsia="Arial" w:hAnsi="Arial"/>
+                <w:color w:val="000000"/>
                 <w:sz w:val="20"/>
                 <w:szCs w:val="20"/>
               </w:rPr>
@@ -1639,6 +1544,7 @@
             <w:r>
               <w:rPr>
                 <w:rFonts w:ascii="Arial" w:cs="Arial" w:eastAsia="Arial" w:hAnsi="Arial"/>
+                <w:color w:val="000000"/>
                 <w:sz w:val="20"/>
                 <w:szCs w:val="20"/>
               </w:rPr>
@@ -1674,6 +1580,7 @@
             <w:r>
               <w:rPr>
                 <w:rFonts w:ascii="Arial" w:cs="Arial" w:eastAsia="Arial" w:hAnsi="Arial"/>
+                <w:color w:val="000000"/>
                 <w:sz w:val="20"/>
                 <w:szCs w:val="20"/>
               </w:rPr>
@@ -1702,6 +1609,7 @@
             <w:r>
               <w:rPr>
                 <w:rFonts w:ascii="Arial" w:cs="Arial" w:eastAsia="Arial" w:hAnsi="Arial"/>
+                <w:color w:val="000000"/>
                 <w:sz w:val="20"/>
                 <w:szCs w:val="20"/>
               </w:rPr>
@@ -1730,6 +1638,7 @@
             <w:r>
               <w:rPr>
                 <w:rFonts w:ascii="Arial" w:cs="Arial" w:eastAsia="Arial" w:hAnsi="Arial"/>
+                <w:color w:val="000000"/>
                 <w:sz w:val="20"/>
                 <w:szCs w:val="20"/>
               </w:rPr>
@@ -1746,7 +1655,6 @@
         <w:tc>
           <w:tcPr>
             <w:tcW w:type="dxa" w:w="5560"/>
-            <w:shd w:fill="F2F2F2" w:color="auto" w:val="clear"/>
             <w:tcMar>
               <w:top w:type="dxa" w:w="60"/>
               <w:left w:type="dxa" w:w="110"/>
@@ -1767,6 +1675,7 @@
                 <w:rFonts w:ascii="Arial" w:cs="Arial" w:eastAsia="Arial" w:hAnsi="Arial"/>
                 <w:b/>
                 <w:bCs/>
+                <w:color w:val="000000"/>
                 <w:sz w:val="20"/>
                 <w:szCs w:val="20"/>
               </w:rPr>
@@ -1777,7 +1686,6 @@
         <w:tc>
           <w:tcPr>
             <w:tcW w:type="dxa" w:w="1900"/>
-            <w:shd w:fill="F2F2F2" w:color="auto" w:val="clear"/>
             <w:tcMar>
               <w:top w:type="dxa" w:w="60"/>
               <w:left w:type="dxa" w:w="110"/>
@@ -1798,6 +1706,7 @@
                 <w:rFonts w:ascii="Arial" w:cs="Arial" w:eastAsia="Arial" w:hAnsi="Arial"/>
                 <w:b/>
                 <w:bCs/>
+                <w:color w:val="000000"/>
                 <w:sz w:val="20"/>
                 <w:szCs w:val="20"/>
               </w:rPr>
@@ -1808,7 +1717,6 @@
         <w:tc>
           <w:tcPr>
             <w:tcW w:type="dxa" w:w="1900"/>
-            <w:shd w:fill="F2F2F2" w:color="auto" w:val="clear"/>
             <w:tcMar>
               <w:top w:type="dxa" w:w="60"/>
               <w:left w:type="dxa" w:w="110"/>
@@ -1829,6 +1737,7 @@
                 <w:rFonts w:ascii="Arial" w:cs="Arial" w:eastAsia="Arial" w:hAnsi="Arial"/>
                 <w:b/>
                 <w:bCs/>
+                <w:color w:val="000000"/>
                 <w:sz w:val="20"/>
                 <w:szCs w:val="20"/>
               </w:rPr>
@@ -1864,6 +1773,7 @@
             <w:r>
               <w:rPr>
                 <w:rFonts w:ascii="Arial" w:cs="Arial" w:eastAsia="Arial" w:hAnsi="Arial"/>
+                <w:color w:val="000000"/>
                 <w:sz w:val="20"/>
                 <w:szCs w:val="20"/>
               </w:rPr>
@@ -1892,6 +1802,7 @@
             <w:r>
               <w:rPr>
                 <w:rFonts w:ascii="Arial" w:cs="Arial" w:eastAsia="Arial" w:hAnsi="Arial"/>
+                <w:color w:val="000000"/>
                 <w:sz w:val="20"/>
                 <w:szCs w:val="20"/>
               </w:rPr>
@@ -1920,6 +1831,7 @@
             <w:r>
               <w:rPr>
                 <w:rFonts w:ascii="Arial" w:cs="Arial" w:eastAsia="Arial" w:hAnsi="Arial"/>
+                <w:color w:val="000000"/>
                 <w:sz w:val="20"/>
                 <w:szCs w:val="20"/>
               </w:rPr>
@@ -1936,7 +1848,6 @@
         <w:tc>
           <w:tcPr>
             <w:tcW w:type="dxa" w:w="5560"/>
-            <w:shd w:fill="FFF2CC" w:color="auto" w:val="clear"/>
             <w:tcMar>
               <w:top w:type="dxa" w:w="60"/>
               <w:left w:type="dxa" w:w="110"/>
@@ -1957,6 +1868,7 @@
                 <w:rFonts w:ascii="Arial" w:cs="Arial" w:eastAsia="Arial" w:hAnsi="Arial"/>
                 <w:b/>
                 <w:bCs/>
+                <w:color w:val="000000"/>
                 <w:sz w:val="20"/>
                 <w:szCs w:val="20"/>
               </w:rPr>
@@ -1967,7 +1879,6 @@
         <w:tc>
           <w:tcPr>
             <w:tcW w:type="dxa" w:w="1900"/>
-            <w:shd w:fill="FFF2CC" w:color="auto" w:val="clear"/>
             <w:tcMar>
               <w:top w:type="dxa" w:w="60"/>
               <w:left w:type="dxa" w:w="110"/>
@@ -1988,6 +1899,7 @@
                 <w:rFonts w:ascii="Arial" w:cs="Arial" w:eastAsia="Arial" w:hAnsi="Arial"/>
                 <w:b/>
                 <w:bCs/>
+                <w:color w:val="000000"/>
                 <w:sz w:val="20"/>
                 <w:szCs w:val="20"/>
               </w:rPr>
@@ -1998,7 +1910,6 @@
         <w:tc>
           <w:tcPr>
             <w:tcW w:type="dxa" w:w="1900"/>
-            <w:shd w:fill="FFF2CC" w:color="auto" w:val="clear"/>
             <w:tcMar>
               <w:top w:type="dxa" w:w="60"/>
               <w:left w:type="dxa" w:w="110"/>
@@ -2019,6 +1930,7 @@
                 <w:rFonts w:ascii="Arial" w:cs="Arial" w:eastAsia="Arial" w:hAnsi="Arial"/>
                 <w:b/>
                 <w:bCs/>
+                <w:color w:val="000000"/>
                 <w:sz w:val="20"/>
                 <w:szCs w:val="20"/>
               </w:rPr>
@@ -2035,11 +1947,6 @@
         <w:tc>
           <w:tcPr>
             <w:tcW w:type="dxa" w:w="5560"/>
-            <w:tcBorders>
-              <w:top w:val="single" w:color="000000" w:sz="8"/>
-              <w:bottom w:val="double" w:color="000000" w:sz="6"/>
-            </w:tcBorders>
-            <w:shd w:fill="F2F2F2" w:color="auto" w:val="clear"/>
             <w:tcMar>
               <w:top w:type="dxa" w:w="60"/>
               <w:left w:type="dxa" w:w="110"/>
@@ -2060,6 +1967,7 @@
                 <w:rFonts w:ascii="Arial" w:cs="Arial" w:eastAsia="Arial" w:hAnsi="Arial"/>
                 <w:b/>
                 <w:bCs/>
+                <w:color w:val="000000"/>
                 <w:sz w:val="20"/>
                 <w:szCs w:val="20"/>
               </w:rPr>
@@ -2070,11 +1978,6 @@
         <w:tc>
           <w:tcPr>
             <w:tcW w:type="dxa" w:w="1900"/>
-            <w:tcBorders>
-              <w:top w:val="single" w:color="000000" w:sz="8"/>
-              <w:bottom w:val="double" w:color="000000" w:sz="6"/>
-            </w:tcBorders>
-            <w:shd w:fill="F2F2F2" w:color="auto" w:val="clear"/>
             <w:tcMar>
               <w:top w:type="dxa" w:w="60"/>
               <w:left w:type="dxa" w:w="110"/>
@@ -2095,6 +1998,7 @@
                 <w:rFonts w:ascii="Arial" w:cs="Arial" w:eastAsia="Arial" w:hAnsi="Arial"/>
                 <w:b/>
                 <w:bCs/>
+                <w:color w:val="000000"/>
                 <w:sz w:val="20"/>
                 <w:szCs w:val="20"/>
               </w:rPr>
@@ -2105,11 +2009,6 @@
         <w:tc>
           <w:tcPr>
             <w:tcW w:type="dxa" w:w="1900"/>
-            <w:tcBorders>
-              <w:top w:val="single" w:color="000000" w:sz="8"/>
-              <w:bottom w:val="double" w:color="000000" w:sz="6"/>
-            </w:tcBorders>
-            <w:shd w:fill="F2F2F2" w:color="auto" w:val="clear"/>
             <w:tcMar>
               <w:top w:type="dxa" w:w="60"/>
               <w:left w:type="dxa" w:w="110"/>
@@ -2130,6 +2029,7 @@
                 <w:rFonts w:ascii="Arial" w:cs="Arial" w:eastAsia="Arial" w:hAnsi="Arial"/>
                 <w:b/>
                 <w:bCs/>
+                <w:color w:val="000000"/>
                 <w:sz w:val="20"/>
                 <w:szCs w:val="20"/>
               </w:rPr>
@@ -2147,6 +2047,7 @@
       <w:r>
         <w:rPr>
           <w:rFonts w:ascii="Arial" w:cs="Arial" w:eastAsia="Arial" w:hAnsi="Arial"/>
+          <w:color w:val="000000"/>
           <w:sz w:val="22"/>
           <w:szCs w:val="22"/>
         </w:rPr>
@@ -2161,6 +2062,7 @@
       <w:r>
         <w:rPr>
           <w:rFonts w:ascii="Arial" w:cs="Arial" w:eastAsia="Arial" w:hAnsi="Arial"/>
+          <w:color w:val="000000"/>
           <w:sz w:val="22"/>
           <w:szCs w:val="22"/>
         </w:rPr>
@@ -2176,33 +2078,11 @@
           <w:rFonts w:ascii="Arial" w:cs="Arial" w:eastAsia="Arial" w:hAnsi="Arial"/>
           <w:b/>
           <w:bCs/>
-          <w:color w:val="1F3864"/>
-          <w:sz w:val="28"/>
-          <w:szCs w:val="28"/>
-        </w:rPr>
-        <w:t xml:space="preserve">Question 3: Cost of long-term debt</w:t>
-      </w:r>
-    </w:p>
-    <w:p>
-      <w:pPr>
-        <w:keepNext/>
-        <w:keepLines/>
-        <w:pBdr>
-          <w:left w:val="single" w:color="1F3864" w:sz="18" w:space="8"/>
-        </w:pBdr>
-        <w:spacing w:after="200" w:before="0" w:line="276" w:lineRule="auto"/>
-        <w:ind w:left="200"/>
-      </w:pPr>
-      <w:r>
-        <w:rPr>
-          <w:rFonts w:ascii="Arial" w:cs="Arial" w:eastAsia="Arial" w:hAnsi="Arial"/>
-          <w:i/>
-          <w:iCs/>
-          <w:color w:val="595959"/>
-          <w:sz w:val="20"/>
-          <w:szCs w:val="20"/>
-        </w:rPr>
-        <w:t xml:space="preserve">Determine which source of debt should be used in calculating the cost of long-term debt. What is the cost of long-term debt? (Need to list source and cost)</w:t>
+          <w:color w:val="000000"/>
+          <w:sz w:val="26"/>
+          <w:szCs w:val="26"/>
+        </w:rPr>
+        <w:t xml:space="preserve">Question 3</w:t>
       </w:r>
     </w:p>
     <w:p>
@@ -2214,6 +2094,7 @@
       <w:r>
         <w:rPr>
           <w:rFonts w:ascii="Arial" w:cs="Arial" w:eastAsia="Arial" w:hAnsi="Arial"/>
+          <w:color w:val="000000"/>
           <w:sz w:val="22"/>
           <w:szCs w:val="22"/>
         </w:rPr>
@@ -2231,7 +2112,7 @@
           <w:rFonts w:ascii="Arial" w:cs="Arial" w:eastAsia="Arial" w:hAnsi="Arial"/>
           <w:b/>
           <w:bCs/>
-          <w:color w:val="1F3864"/>
+          <w:color w:val="000000"/>
           <w:sz w:val="20"/>
           <w:szCs w:val="20"/>
         </w:rPr>
@@ -2242,12 +2123,12 @@
       <w:tblPr>
         <w:tblW w:type="dxa" w:w="9360"/>
         <w:tblBorders>
-          <w:top w:val="single" w:color="BFBFBF" w:sz="4"/>
-          <w:left w:val="single" w:color="BFBFBF" w:sz="4"/>
-          <w:bottom w:val="single" w:color="BFBFBF" w:sz="4"/>
-          <w:right w:val="single" w:color="BFBFBF" w:sz="4"/>
-          <w:insideH w:val="single" w:color="BFBFBF" w:sz="4"/>
-          <w:insideV w:val="single" w:color="BFBFBF" w:sz="4"/>
+          <w:top w:val="single" w:color="000000" w:sz="4"/>
+          <w:left w:val="single" w:color="000000" w:sz="4"/>
+          <w:bottom w:val="single" w:color="000000" w:sz="4"/>
+          <w:right w:val="single" w:color="000000" w:sz="4"/>
+          <w:insideH w:val="single" w:color="000000" w:sz="4"/>
+          <w:insideV w:val="single" w:color="000000" w:sz="4"/>
         </w:tblBorders>
         <w:tblLayout w:type="fixed"/>
       </w:tblPr>
@@ -2265,7 +2146,6 @@
         <w:tc>
           <w:tcPr>
             <w:tcW w:type="dxa" w:w="4160"/>
-            <w:shd w:fill="1F3864" w:color="auto" w:val="clear"/>
             <w:tcMar>
               <w:top w:type="dxa" w:w="60"/>
               <w:left w:type="dxa" w:w="110"/>
@@ -2286,7 +2166,7 @@
                 <w:rFonts w:ascii="Arial" w:cs="Arial" w:eastAsia="Arial" w:hAnsi="Arial"/>
                 <w:b/>
                 <w:bCs/>
-                <w:color w:val="FFFFFF"/>
+                <w:color w:val="000000"/>
                 <w:sz w:val="20"/>
                 <w:szCs w:val="20"/>
               </w:rPr>
@@ -2297,7 +2177,6 @@
         <w:tc>
           <w:tcPr>
             <w:tcW w:type="dxa" w:w="1700"/>
-            <w:shd w:fill="1F3864" w:color="auto" w:val="clear"/>
             <w:tcMar>
               <w:top w:type="dxa" w:w="60"/>
               <w:left w:type="dxa" w:w="110"/>
@@ -2318,7 +2197,7 @@
                 <w:rFonts w:ascii="Arial" w:cs="Arial" w:eastAsia="Arial" w:hAnsi="Arial"/>
                 <w:b/>
                 <w:bCs/>
-                <w:color w:val="FFFFFF"/>
+                <w:color w:val="000000"/>
                 <w:sz w:val="20"/>
                 <w:szCs w:val="20"/>
               </w:rPr>
@@ -2329,7 +2208,6 @@
         <w:tc>
           <w:tcPr>
             <w:tcW w:type="dxa" w:w="1700"/>
-            <w:shd w:fill="1F3864" w:color="auto" w:val="clear"/>
             <w:tcMar>
               <w:top w:type="dxa" w:w="60"/>
               <w:left w:type="dxa" w:w="110"/>
@@ -2350,7 +2228,7 @@
                 <w:rFonts w:ascii="Arial" w:cs="Arial" w:eastAsia="Arial" w:hAnsi="Arial"/>
                 <w:b/>
                 <w:bCs/>
-                <w:color w:val="FFFFFF"/>
+                <w:color w:val="000000"/>
                 <w:sz w:val="20"/>
                 <w:szCs w:val="20"/>
               </w:rPr>
@@ -2361,7 +2239,6 @@
         <w:tc>
           <w:tcPr>
             <w:tcW w:type="dxa" w:w="1800"/>
-            <w:shd w:fill="1F3864" w:color="auto" w:val="clear"/>
             <w:tcMar>
               <w:top w:type="dxa" w:w="60"/>
               <w:left w:type="dxa" w:w="110"/>
@@ -2382,7 +2259,7 @@
                 <w:rFonts w:ascii="Arial" w:cs="Arial" w:eastAsia="Arial" w:hAnsi="Arial"/>
                 <w:b/>
                 <w:bCs/>
-                <w:color w:val="FFFFFF"/>
+                <w:color w:val="000000"/>
                 <w:sz w:val="20"/>
                 <w:szCs w:val="20"/>
               </w:rPr>
@@ -2417,6 +2294,7 @@
             <w:r>
               <w:rPr>
                 <w:rFonts w:ascii="Arial" w:cs="Arial" w:eastAsia="Arial" w:hAnsi="Arial"/>
+                <w:color w:val="000000"/>
                 <w:sz w:val="20"/>
                 <w:szCs w:val="20"/>
               </w:rPr>
@@ -2445,6 +2323,7 @@
             <w:r>
               <w:rPr>
                 <w:rFonts w:ascii="Arial" w:cs="Arial" w:eastAsia="Arial" w:hAnsi="Arial"/>
+                <w:color w:val="000000"/>
                 <w:sz w:val="20"/>
                 <w:szCs w:val="20"/>
               </w:rPr>
@@ -2473,6 +2352,7 @@
             <w:r>
               <w:rPr>
                 <w:rFonts w:ascii="Arial" w:cs="Arial" w:eastAsia="Arial" w:hAnsi="Arial"/>
+                <w:color w:val="000000"/>
                 <w:sz w:val="20"/>
                 <w:szCs w:val="20"/>
               </w:rPr>
@@ -2501,6 +2381,7 @@
             <w:r>
               <w:rPr>
                 <w:rFonts w:ascii="Arial" w:cs="Arial" w:eastAsia="Arial" w:hAnsi="Arial"/>
+                <w:color w:val="000000"/>
                 <w:sz w:val="20"/>
                 <w:szCs w:val="20"/>
               </w:rPr>
@@ -2535,6 +2416,7 @@
             <w:r>
               <w:rPr>
                 <w:rFonts w:ascii="Arial" w:cs="Arial" w:eastAsia="Arial" w:hAnsi="Arial"/>
+                <w:color w:val="000000"/>
                 <w:sz w:val="20"/>
                 <w:szCs w:val="20"/>
               </w:rPr>
@@ -2563,6 +2445,7 @@
             <w:r>
               <w:rPr>
                 <w:rFonts w:ascii="Arial" w:cs="Arial" w:eastAsia="Arial" w:hAnsi="Arial"/>
+                <w:color w:val="000000"/>
                 <w:sz w:val="20"/>
                 <w:szCs w:val="20"/>
               </w:rPr>
@@ -2591,6 +2474,7 @@
             <w:r>
               <w:rPr>
                 <w:rFonts w:ascii="Arial" w:cs="Arial" w:eastAsia="Arial" w:hAnsi="Arial"/>
+                <w:color w:val="000000"/>
                 <w:sz w:val="20"/>
                 <w:szCs w:val="20"/>
               </w:rPr>
@@ -2619,6 +2503,7 @@
             <w:r>
               <w:rPr>
                 <w:rFonts w:ascii="Arial" w:cs="Arial" w:eastAsia="Arial" w:hAnsi="Arial"/>
+                <w:color w:val="000000"/>
                 <w:sz w:val="20"/>
                 <w:szCs w:val="20"/>
               </w:rPr>
@@ -2635,11 +2520,6 @@
         <w:tc>
           <w:tcPr>
             <w:tcW w:type="dxa" w:w="4160"/>
-            <w:tcBorders>
-              <w:top w:val="single" w:color="000000" w:sz="8"/>
-              <w:bottom w:val="double" w:color="000000" w:sz="6"/>
-            </w:tcBorders>
-            <w:shd w:fill="F2F2F2" w:color="auto" w:val="clear"/>
             <w:tcMar>
               <w:top w:type="dxa" w:w="60"/>
               <w:left w:type="dxa" w:w="110"/>
@@ -2660,6 +2540,7 @@
                 <w:rFonts w:ascii="Arial" w:cs="Arial" w:eastAsia="Arial" w:hAnsi="Arial"/>
                 <w:b/>
                 <w:bCs/>
+                <w:color w:val="000000"/>
                 <w:sz w:val="20"/>
                 <w:szCs w:val="20"/>
               </w:rPr>
@@ -2670,11 +2551,6 @@
         <w:tc>
           <w:tcPr>
             <w:tcW w:type="dxa" w:w="1700"/>
-            <w:tcBorders>
-              <w:top w:val="single" w:color="000000" w:sz="8"/>
-              <w:bottom w:val="double" w:color="000000" w:sz="6"/>
-            </w:tcBorders>
-            <w:shd w:fill="F2F2F2" w:color="auto" w:val="clear"/>
             <w:tcMar>
               <w:top w:type="dxa" w:w="60"/>
               <w:left w:type="dxa" w:w="110"/>
@@ -2695,6 +2571,7 @@
                 <w:rFonts w:ascii="Arial" w:cs="Arial" w:eastAsia="Arial" w:hAnsi="Arial"/>
                 <w:b/>
                 <w:bCs/>
+                <w:color w:val="000000"/>
                 <w:sz w:val="20"/>
                 <w:szCs w:val="20"/>
               </w:rPr>
@@ -2705,11 +2582,6 @@
         <w:tc>
           <w:tcPr>
             <w:tcW w:type="dxa" w:w="1700"/>
-            <w:tcBorders>
-              <w:top w:val="single" w:color="000000" w:sz="8"/>
-              <w:bottom w:val="double" w:color="000000" w:sz="6"/>
-            </w:tcBorders>
-            <w:shd w:fill="F2F2F2" w:color="auto" w:val="clear"/>
             <w:tcMar>
               <w:top w:type="dxa" w:w="60"/>
               <w:left w:type="dxa" w:w="110"/>
@@ -2730,6 +2602,7 @@
                 <w:rFonts w:ascii="Arial" w:cs="Arial" w:eastAsia="Arial" w:hAnsi="Arial"/>
                 <w:b/>
                 <w:bCs/>
+                <w:color w:val="000000"/>
                 <w:sz w:val="20"/>
                 <w:szCs w:val="20"/>
               </w:rPr>
@@ -2740,11 +2613,6 @@
         <w:tc>
           <w:tcPr>
             <w:tcW w:type="dxa" w:w="1800"/>
-            <w:tcBorders>
-              <w:top w:val="single" w:color="000000" w:sz="8"/>
-              <w:bottom w:val="double" w:color="000000" w:sz="6"/>
-            </w:tcBorders>
-            <w:shd w:fill="F2F2F2" w:color="auto" w:val="clear"/>
             <w:tcMar>
               <w:top w:type="dxa" w:w="60"/>
               <w:left w:type="dxa" w:w="110"/>
@@ -2765,6 +2633,7 @@
                 <w:rFonts w:ascii="Arial" w:cs="Arial" w:eastAsia="Arial" w:hAnsi="Arial"/>
                 <w:b/>
                 <w:bCs/>
+                <w:color w:val="000000"/>
                 <w:sz w:val="20"/>
                 <w:szCs w:val="20"/>
               </w:rPr>
@@ -2782,6 +2651,7 @@
       <w:r>
         <w:rPr>
           <w:rFonts w:ascii="Arial" w:cs="Arial" w:eastAsia="Arial" w:hAnsi="Arial"/>
+          <w:color w:val="000000"/>
           <w:sz w:val="22"/>
           <w:szCs w:val="22"/>
         </w:rPr>
@@ -2799,7 +2669,7 @@
           <w:rFonts w:ascii="Arial" w:cs="Arial" w:eastAsia="Arial" w:hAnsi="Arial"/>
           <w:b/>
           <w:bCs/>
-          <w:color w:val="1F3864"/>
+          <w:color w:val="000000"/>
           <w:sz w:val="20"/>
           <w:szCs w:val="20"/>
         </w:rPr>
@@ -2810,12 +2680,12 @@
       <w:tblPr>
         <w:tblW w:type="dxa" w:w="9360"/>
         <w:tblBorders>
-          <w:top w:val="single" w:color="BFBFBF" w:sz="4"/>
-          <w:left w:val="single" w:color="BFBFBF" w:sz="4"/>
-          <w:bottom w:val="single" w:color="BFBFBF" w:sz="4"/>
-          <w:right w:val="single" w:color="BFBFBF" w:sz="4"/>
-          <w:insideH w:val="single" w:color="BFBFBF" w:sz="4"/>
-          <w:insideV w:val="single" w:color="BFBFBF" w:sz="4"/>
+          <w:top w:val="single" w:color="000000" w:sz="4"/>
+          <w:left w:val="single" w:color="000000" w:sz="4"/>
+          <w:bottom w:val="single" w:color="000000" w:sz="4"/>
+          <w:right w:val="single" w:color="000000" w:sz="4"/>
+          <w:insideH w:val="single" w:color="000000" w:sz="4"/>
+          <w:insideV w:val="single" w:color="000000" w:sz="4"/>
         </w:tblBorders>
         <w:tblLayout w:type="fixed"/>
       </w:tblPr>
@@ -2851,6 +2721,7 @@
                 <w:rFonts w:ascii="Arial" w:cs="Arial" w:eastAsia="Arial" w:hAnsi="Arial"/>
                 <w:b/>
                 <w:bCs/>
+                <w:color w:val="000000"/>
                 <w:sz w:val="20"/>
                 <w:szCs w:val="20"/>
               </w:rPr>
@@ -2881,6 +2752,7 @@
                 <w:rFonts w:ascii="Arial" w:cs="Arial" w:eastAsia="Arial" w:hAnsi="Arial"/>
                 <w:b w:val="false"/>
                 <w:bCs w:val="false"/>
+                <w:color w:val="000000"/>
                 <w:sz w:val="20"/>
                 <w:szCs w:val="20"/>
               </w:rPr>
@@ -2897,7 +2769,6 @@
         <w:tc>
           <w:tcPr>
             <w:tcW w:type="dxa" w:w="2800"/>
-            <w:shd w:fill="FFF2CC" w:color="auto" w:val="clear"/>
             <w:tcMar>
               <w:top w:type="dxa" w:w="60"/>
               <w:left w:type="dxa" w:w="110"/>
@@ -2918,6 +2789,7 @@
                 <w:rFonts w:ascii="Arial" w:cs="Arial" w:eastAsia="Arial" w:hAnsi="Arial"/>
                 <w:b/>
                 <w:bCs/>
+                <w:color w:val="000000"/>
                 <w:sz w:val="20"/>
                 <w:szCs w:val="20"/>
               </w:rPr>
@@ -2928,7 +2800,6 @@
         <w:tc>
           <w:tcPr>
             <w:tcW w:type="dxa" w:w="6560"/>
-            <w:shd w:fill="FFF2CC" w:color="auto" w:val="clear"/>
             <w:tcMar>
               <w:top w:type="dxa" w:w="60"/>
               <w:left w:type="dxa" w:w="110"/>
@@ -2947,8 +2818,9 @@
             <w:r>
               <w:rPr>
                 <w:rFonts w:ascii="Arial" w:cs="Arial" w:eastAsia="Arial" w:hAnsi="Arial"/>
-                <w:b/>
-                <w:bCs/>
+                <w:b w:val="false"/>
+                <w:bCs w:val="false"/>
+                <w:color w:val="000000"/>
                 <w:sz w:val="20"/>
                 <w:szCs w:val="20"/>
               </w:rPr>
@@ -2966,6 +2838,7 @@
       <w:r>
         <w:rPr>
           <w:rFonts w:ascii="Arial" w:cs="Arial" w:eastAsia="Arial" w:hAnsi="Arial"/>
+          <w:color w:val="000000"/>
           <w:sz w:val="22"/>
           <w:szCs w:val="22"/>
         </w:rPr>
@@ -2981,33 +2854,27 @@
           <w:rFonts w:ascii="Arial" w:cs="Arial" w:eastAsia="Arial" w:hAnsi="Arial"/>
           <w:b/>
           <w:bCs/>
-          <w:color w:val="1F3864"/>
-          <w:sz w:val="28"/>
-          <w:szCs w:val="28"/>
-        </w:rPr>
-        <w:t xml:space="preserve">Question 4: Cost of equity (CAPM)</w:t>
+          <w:color w:val="000000"/>
+          <w:sz w:val="26"/>
+          <w:szCs w:val="26"/>
+        </w:rPr>
+        <w:t xml:space="preserve">Question 4</w:t>
       </w:r>
     </w:p>
     <w:p>
       <w:pPr>
         <w:keepNext/>
         <w:keepLines/>
-        <w:pBdr>
-          <w:left w:val="single" w:color="1F3864" w:sz="18" w:space="8"/>
-        </w:pBdr>
-        <w:spacing w:after="200" w:before="0" w:line="276" w:lineRule="auto"/>
-        <w:ind w:left="200"/>
+        <w:spacing w:after="120" w:before="0" w:line="276" w:lineRule="auto"/>
       </w:pPr>
       <w:r>
         <w:rPr>
           <w:rFonts w:ascii="Arial" w:cs="Arial" w:eastAsia="Arial" w:hAnsi="Arial"/>
-          <w:i/>
-          <w:iCs/>
-          <w:color w:val="595959"/>
-          <w:sz w:val="20"/>
-          <w:szCs w:val="20"/>
-        </w:rPr>
-        <w:t xml:space="preserve">Using the Capital Asset Pricing Model, determine the cost of equity, where Ke = Rf + β(MRP). Ke is the cost of equity, Rf is the risk-free rate, β is the stock's beta and MRP is the market risk premium. Justify your choice for the market risk premium.</w:t>
+          <w:color w:val="000000"/>
+          <w:sz w:val="22"/>
+          <w:szCs w:val="22"/>
+        </w:rPr>
+        <w:t xml:space="preserve">Under the Capital Asset Pricing Model (CAPM), the cost of equity is:</w:t>
       </w:r>
     </w:p>
     <w:p>
@@ -3022,6 +2889,7 @@
           <w:rFonts w:ascii="Arial" w:cs="Arial" w:eastAsia="Arial" w:hAnsi="Arial"/>
           <w:b/>
           <w:bCs/>
+          <w:color w:val="000000"/>
           <w:sz w:val="22"/>
           <w:szCs w:val="22"/>
         </w:rPr>
@@ -3032,6 +2900,7 @@
           <w:rFonts w:ascii="Arial" w:cs="Arial" w:eastAsia="Arial" w:hAnsi="Arial"/>
           <w:b/>
           <w:bCs/>
+          <w:color w:val="000000"/>
           <w:sz w:val="22"/>
           <w:szCs w:val="22"/>
           <w:vertAlign w:val="subscript"/>
@@ -3043,6 +2912,7 @@
           <w:rFonts w:ascii="Arial" w:cs="Arial" w:eastAsia="Arial" w:hAnsi="Arial"/>
           <w:b/>
           <w:bCs/>
+          <w:color w:val="000000"/>
           <w:sz w:val="22"/>
           <w:szCs w:val="22"/>
         </w:rPr>
@@ -3053,6 +2923,7 @@
           <w:rFonts w:ascii="Arial" w:cs="Arial" w:eastAsia="Arial" w:hAnsi="Arial"/>
           <w:b/>
           <w:bCs/>
+          <w:color w:val="000000"/>
           <w:sz w:val="22"/>
           <w:szCs w:val="22"/>
           <w:vertAlign w:val="subscript"/>
@@ -3064,6 +2935,7 @@
           <w:rFonts w:ascii="Arial" w:cs="Arial" w:eastAsia="Arial" w:hAnsi="Arial"/>
           <w:b/>
           <w:bCs/>
+          <w:color w:val="000000"/>
           <w:sz w:val="22"/>
           <w:szCs w:val="22"/>
         </w:rPr>
@@ -3081,7 +2953,7 @@
           <w:rFonts w:ascii="Arial" w:cs="Arial" w:eastAsia="Arial" w:hAnsi="Arial"/>
           <w:b/>
           <w:bCs/>
-          <w:color w:val="1F3864"/>
+          <w:color w:val="000000"/>
           <w:sz w:val="20"/>
           <w:szCs w:val="20"/>
         </w:rPr>
@@ -3092,12 +2964,12 @@
       <w:tblPr>
         <w:tblW w:type="dxa" w:w="9360"/>
         <w:tblBorders>
-          <w:top w:val="single" w:color="BFBFBF" w:sz="4"/>
-          <w:left w:val="single" w:color="BFBFBF" w:sz="4"/>
-          <w:bottom w:val="single" w:color="BFBFBF" w:sz="4"/>
-          <w:right w:val="single" w:color="BFBFBF" w:sz="4"/>
-          <w:insideH w:val="single" w:color="BFBFBF" w:sz="4"/>
-          <w:insideV w:val="single" w:color="BFBFBF" w:sz="4"/>
+          <w:top w:val="single" w:color="000000" w:sz="4"/>
+          <w:left w:val="single" w:color="000000" w:sz="4"/>
+          <w:bottom w:val="single" w:color="000000" w:sz="4"/>
+          <w:right w:val="single" w:color="000000" w:sz="4"/>
+          <w:insideH w:val="single" w:color="000000" w:sz="4"/>
+          <w:insideV w:val="single" w:color="000000" w:sz="4"/>
         </w:tblBorders>
         <w:tblLayout w:type="fixed"/>
       </w:tblPr>
@@ -3114,7 +2986,6 @@
         <w:tc>
           <w:tcPr>
             <w:tcW w:type="dxa" w:w="4060"/>
-            <w:shd w:fill="1F3864" w:color="auto" w:val="clear"/>
             <w:tcMar>
               <w:top w:type="dxa" w:w="60"/>
               <w:left w:type="dxa" w:w="110"/>
@@ -3135,7 +3006,7 @@
                 <w:rFonts w:ascii="Arial" w:cs="Arial" w:eastAsia="Arial" w:hAnsi="Arial"/>
                 <w:b/>
                 <w:bCs/>
-                <w:color w:val="FFFFFF"/>
+                <w:color w:val="000000"/>
                 <w:sz w:val="20"/>
                 <w:szCs w:val="20"/>
               </w:rPr>
@@ -3146,7 +3017,6 @@
         <w:tc>
           <w:tcPr>
             <w:tcW w:type="dxa" w:w="1500"/>
-            <w:shd w:fill="1F3864" w:color="auto" w:val="clear"/>
             <w:tcMar>
               <w:top w:type="dxa" w:w="60"/>
               <w:left w:type="dxa" w:w="110"/>
@@ -3167,7 +3037,7 @@
                 <w:rFonts w:ascii="Arial" w:cs="Arial" w:eastAsia="Arial" w:hAnsi="Arial"/>
                 <w:b/>
                 <w:bCs/>
-                <w:color w:val="FFFFFF"/>
+                <w:color w:val="000000"/>
                 <w:sz w:val="20"/>
                 <w:szCs w:val="20"/>
               </w:rPr>
@@ -3178,7 +3048,6 @@
         <w:tc>
           <w:tcPr>
             <w:tcW w:type="dxa" w:w="3800"/>
-            <w:shd w:fill="1F3864" w:color="auto" w:val="clear"/>
             <w:tcMar>
               <w:top w:type="dxa" w:w="60"/>
               <w:left w:type="dxa" w:w="110"/>
@@ -3199,7 +3068,7 @@
                 <w:rFonts w:ascii="Arial" w:cs="Arial" w:eastAsia="Arial" w:hAnsi="Arial"/>
                 <w:b/>
                 <w:bCs/>
-                <w:color w:val="FFFFFF"/>
+                <w:color w:val="000000"/>
                 <w:sz w:val="20"/>
                 <w:szCs w:val="20"/>
               </w:rPr>
@@ -3234,6 +3103,7 @@
             <w:r>
               <w:rPr>
                 <w:rFonts w:ascii="Arial" w:cs="Arial" w:eastAsia="Arial" w:hAnsi="Arial"/>
+                <w:color w:val="000000"/>
                 <w:sz w:val="20"/>
                 <w:szCs w:val="20"/>
               </w:rPr>
@@ -3262,6 +3132,7 @@
             <w:r>
               <w:rPr>
                 <w:rFonts w:ascii="Arial" w:cs="Arial" w:eastAsia="Arial" w:hAnsi="Arial"/>
+                <w:color w:val="000000"/>
                 <w:sz w:val="20"/>
                 <w:szCs w:val="20"/>
               </w:rPr>
@@ -3290,6 +3161,7 @@
             <w:r>
               <w:rPr>
                 <w:rFonts w:ascii="Arial" w:cs="Arial" w:eastAsia="Arial" w:hAnsi="Arial"/>
+                <w:color w:val="000000"/>
                 <w:sz w:val="20"/>
                 <w:szCs w:val="20"/>
               </w:rPr>
@@ -3324,6 +3196,7 @@
             <w:r>
               <w:rPr>
                 <w:rFonts w:ascii="Arial" w:cs="Arial" w:eastAsia="Arial" w:hAnsi="Arial"/>
+                <w:color w:val="000000"/>
                 <w:sz w:val="20"/>
                 <w:szCs w:val="20"/>
               </w:rPr>
@@ -3352,6 +3225,7 @@
             <w:r>
               <w:rPr>
                 <w:rFonts w:ascii="Arial" w:cs="Arial" w:eastAsia="Arial" w:hAnsi="Arial"/>
+                <w:color w:val="000000"/>
                 <w:sz w:val="20"/>
                 <w:szCs w:val="20"/>
               </w:rPr>
@@ -3380,6 +3254,7 @@
             <w:r>
               <w:rPr>
                 <w:rFonts w:ascii="Arial" w:cs="Arial" w:eastAsia="Arial" w:hAnsi="Arial"/>
+                <w:color w:val="000000"/>
                 <w:sz w:val="20"/>
                 <w:szCs w:val="20"/>
               </w:rPr>
@@ -3414,6 +3289,7 @@
             <w:r>
               <w:rPr>
                 <w:rFonts w:ascii="Arial" w:cs="Arial" w:eastAsia="Arial" w:hAnsi="Arial"/>
+                <w:color w:val="000000"/>
                 <w:sz w:val="20"/>
                 <w:szCs w:val="20"/>
               </w:rPr>
@@ -3442,6 +3318,7 @@
             <w:r>
               <w:rPr>
                 <w:rFonts w:ascii="Arial" w:cs="Arial" w:eastAsia="Arial" w:hAnsi="Arial"/>
+                <w:color w:val="000000"/>
                 <w:sz w:val="20"/>
                 <w:szCs w:val="20"/>
               </w:rPr>
@@ -3470,6 +3347,7 @@
             <w:r>
               <w:rPr>
                 <w:rFonts w:ascii="Arial" w:cs="Arial" w:eastAsia="Arial" w:hAnsi="Arial"/>
+                <w:color w:val="000000"/>
                 <w:sz w:val="20"/>
                 <w:szCs w:val="20"/>
               </w:rPr>
@@ -3504,6 +3382,7 @@
             <w:r>
               <w:rPr>
                 <w:rFonts w:ascii="Arial" w:cs="Arial" w:eastAsia="Arial" w:hAnsi="Arial"/>
+                <w:color w:val="000000"/>
                 <w:sz w:val="20"/>
                 <w:szCs w:val="20"/>
               </w:rPr>
@@ -3532,6 +3411,7 @@
             <w:r>
               <w:rPr>
                 <w:rFonts w:ascii="Arial" w:cs="Arial" w:eastAsia="Arial" w:hAnsi="Arial"/>
+                <w:color w:val="000000"/>
                 <w:sz w:val="20"/>
                 <w:szCs w:val="20"/>
               </w:rPr>
@@ -3560,6 +3440,7 @@
             <w:r>
               <w:rPr>
                 <w:rFonts w:ascii="Arial" w:cs="Arial" w:eastAsia="Arial" w:hAnsi="Arial"/>
+                <w:color w:val="000000"/>
                 <w:sz w:val="20"/>
                 <w:szCs w:val="20"/>
               </w:rPr>
@@ -3576,7 +3457,6 @@
         <w:tc>
           <w:tcPr>
             <w:tcW w:type="dxa" w:w="4060"/>
-            <w:shd w:fill="FFF2CC" w:color="auto" w:val="clear"/>
             <w:tcMar>
               <w:top w:type="dxa" w:w="60"/>
               <w:left w:type="dxa" w:w="110"/>
@@ -3597,6 +3477,7 @@
                 <w:rFonts w:ascii="Arial" w:cs="Arial" w:eastAsia="Arial" w:hAnsi="Arial"/>
                 <w:b/>
                 <w:bCs/>
+                <w:color w:val="000000"/>
                 <w:sz w:val="20"/>
                 <w:szCs w:val="20"/>
               </w:rPr>
@@ -3607,7 +3488,6 @@
         <w:tc>
           <w:tcPr>
             <w:tcW w:type="dxa" w:w="1500"/>
-            <w:shd w:fill="FFF2CC" w:color="auto" w:val="clear"/>
             <w:tcMar>
               <w:top w:type="dxa" w:w="60"/>
               <w:left w:type="dxa" w:w="110"/>
@@ -3628,6 +3508,7 @@
                 <w:rFonts w:ascii="Arial" w:cs="Arial" w:eastAsia="Arial" w:hAnsi="Arial"/>
                 <w:b/>
                 <w:bCs/>
+                <w:color w:val="000000"/>
                 <w:sz w:val="20"/>
                 <w:szCs w:val="20"/>
               </w:rPr>
@@ -3638,7 +3519,6 @@
         <w:tc>
           <w:tcPr>
             <w:tcW w:type="dxa" w:w="3800"/>
-            <w:shd w:fill="FFF2CC" w:color="auto" w:val="clear"/>
             <w:tcMar>
               <w:top w:type="dxa" w:w="60"/>
               <w:left w:type="dxa" w:w="110"/>
@@ -3659,6 +3539,7 @@
                 <w:rFonts w:ascii="Arial" w:cs="Arial" w:eastAsia="Arial" w:hAnsi="Arial"/>
                 <w:b/>
                 <w:bCs/>
+                <w:color w:val="000000"/>
                 <w:sz w:val="20"/>
                 <w:szCs w:val="20"/>
               </w:rPr>
@@ -3676,6 +3557,7 @@
       <w:r>
         <w:rPr>
           <w:rFonts w:ascii="Arial" w:cs="Arial" w:eastAsia="Arial" w:hAnsi="Arial"/>
+          <w:color w:val="000000"/>
           <w:sz w:val="22"/>
           <w:szCs w:val="22"/>
         </w:rPr>
@@ -3690,6 +3572,7 @@
       <w:r>
         <w:rPr>
           <w:rFonts w:ascii="Arial" w:cs="Arial" w:eastAsia="Arial" w:hAnsi="Arial"/>
+          <w:color w:val="000000"/>
           <w:sz w:val="22"/>
           <w:szCs w:val="22"/>
         </w:rPr>
@@ -3705,6 +3588,7 @@
       <w:r>
         <w:rPr>
           <w:rFonts w:ascii="Arial" w:cs="Arial" w:eastAsia="Arial" w:hAnsi="Arial"/>
+          <w:color w:val="000000"/>
           <w:sz w:val="22"/>
           <w:szCs w:val="22"/>
         </w:rPr>
@@ -3722,6 +3606,7 @@
       <w:r>
         <w:rPr>
           <w:rFonts w:ascii="Arial" w:cs="Arial" w:eastAsia="Arial" w:hAnsi="Arial"/>
+          <w:color w:val="000000"/>
           <w:sz w:val="22"/>
           <w:szCs w:val="22"/>
         </w:rPr>
@@ -3730,6 +3615,7 @@
       <w:r>
         <w:rPr>
           <w:rFonts w:ascii="Arial" w:cs="Arial" w:eastAsia="Arial" w:hAnsi="Arial"/>
+          <w:color w:val="000000"/>
           <w:sz w:val="22"/>
           <w:szCs w:val="22"/>
           <w:vertAlign w:val="subscript"/>
@@ -3739,6 +3625,7 @@
       <w:r>
         <w:rPr>
           <w:rFonts w:ascii="Arial" w:cs="Arial" w:eastAsia="Arial" w:hAnsi="Arial"/>
+          <w:color w:val="000000"/>
           <w:sz w:val="22"/>
           <w:szCs w:val="22"/>
         </w:rPr>
@@ -3756,6 +3643,7 @@
       <w:r>
         <w:rPr>
           <w:rFonts w:ascii="Arial" w:cs="Arial" w:eastAsia="Arial" w:hAnsi="Arial"/>
+          <w:color w:val="000000"/>
           <w:sz w:val="22"/>
           <w:szCs w:val="22"/>
         </w:rPr>
@@ -3764,6 +3652,7 @@
       <w:r>
         <w:rPr>
           <w:rFonts w:ascii="Arial" w:cs="Arial" w:eastAsia="Arial" w:hAnsi="Arial"/>
+          <w:color w:val="000000"/>
           <w:sz w:val="22"/>
           <w:szCs w:val="22"/>
           <w:vertAlign w:val="subscript"/>
@@ -3773,6 +3662,7 @@
       <w:r>
         <w:rPr>
           <w:rFonts w:ascii="Arial" w:cs="Arial" w:eastAsia="Arial" w:hAnsi="Arial"/>
+          <w:color w:val="000000"/>
           <w:sz w:val="22"/>
           <w:szCs w:val="22"/>
         </w:rPr>
@@ -3792,6 +3682,7 @@
           <w:rFonts w:ascii="Arial" w:cs="Arial" w:eastAsia="Arial" w:hAnsi="Arial"/>
           <w:b/>
           <w:bCs/>
+          <w:color w:val="000000"/>
           <w:sz w:val="22"/>
           <w:szCs w:val="22"/>
         </w:rPr>
@@ -3802,6 +3693,7 @@
           <w:rFonts w:ascii="Arial" w:cs="Arial" w:eastAsia="Arial" w:hAnsi="Arial"/>
           <w:b/>
           <w:bCs/>
+          <w:color w:val="000000"/>
           <w:sz w:val="22"/>
           <w:szCs w:val="22"/>
           <w:vertAlign w:val="subscript"/>
@@ -3813,6 +3705,7 @@
           <w:rFonts w:ascii="Arial" w:cs="Arial" w:eastAsia="Arial" w:hAnsi="Arial"/>
           <w:b/>
           <w:bCs/>
+          <w:color w:val="000000"/>
           <w:sz w:val="22"/>
           <w:szCs w:val="22"/>
         </w:rPr>
@@ -3827,6 +3720,7 @@
       <w:r>
         <w:rPr>
           <w:rFonts w:ascii="Arial" w:cs="Arial" w:eastAsia="Arial" w:hAnsi="Arial"/>
+          <w:color w:val="000000"/>
           <w:sz w:val="22"/>
           <w:szCs w:val="22"/>
         </w:rPr>
@@ -3842,33 +3736,11 @@
           <w:rFonts w:ascii="Arial" w:cs="Arial" w:eastAsia="Arial" w:hAnsi="Arial"/>
           <w:b/>
           <w:bCs/>
-          <w:color w:val="1F3864"/>
-          <w:sz w:val="28"/>
-          <w:szCs w:val="28"/>
-        </w:rPr>
-        <w:t xml:space="preserve">Question 5: Revised sources of financing and debt-to-equity ratio</w:t>
-      </w:r>
-    </w:p>
-    <w:p>
-      <w:pPr>
-        <w:keepNext/>
-        <w:keepLines/>
-        <w:pBdr>
-          <w:left w:val="single" w:color="1F3864" w:sz="18" w:space="8"/>
-        </w:pBdr>
-        <w:spacing w:after="200" w:before="0" w:line="276" w:lineRule="auto"/>
-        <w:ind w:left="200"/>
-      </w:pPr>
-      <w:r>
-        <w:rPr>
-          <w:rFonts w:ascii="Arial" w:cs="Arial" w:eastAsia="Arial" w:hAnsi="Arial"/>
-          <w:i/>
-          <w:iCs/>
-          <w:color w:val="595959"/>
-          <w:sz w:val="20"/>
-          <w:szCs w:val="20"/>
-        </w:rPr>
-        <w:t xml:space="preserve">Create a revised table of sources of financing and determine the Debt-Equity ratio.</w:t>
+          <w:color w:val="000000"/>
+          <w:sz w:val="26"/>
+          <w:szCs w:val="26"/>
+        </w:rPr>
+        <w:t xml:space="preserve">Question 5</w:t>
       </w:r>
     </w:p>
     <w:p>
@@ -3880,6 +3752,7 @@
       <w:r>
         <w:rPr>
           <w:rFonts w:ascii="Arial" w:cs="Arial" w:eastAsia="Arial" w:hAnsi="Arial"/>
+          <w:color w:val="000000"/>
           <w:sz w:val="22"/>
           <w:szCs w:val="22"/>
         </w:rPr>
@@ -3897,7 +3770,7 @@
           <w:rFonts w:ascii="Arial" w:cs="Arial" w:eastAsia="Arial" w:hAnsi="Arial"/>
           <w:b/>
           <w:bCs/>
-          <w:color w:val="1F3864"/>
+          <w:color w:val="000000"/>
           <w:sz w:val="20"/>
           <w:szCs w:val="20"/>
         </w:rPr>
@@ -3908,12 +3781,12 @@
       <w:tblPr>
         <w:tblW w:type="dxa" w:w="9360"/>
         <w:tblBorders>
-          <w:top w:val="single" w:color="BFBFBF" w:sz="4"/>
-          <w:left w:val="single" w:color="BFBFBF" w:sz="4"/>
-          <w:bottom w:val="single" w:color="BFBFBF" w:sz="4"/>
-          <w:right w:val="single" w:color="BFBFBF" w:sz="4"/>
-          <w:insideH w:val="single" w:color="BFBFBF" w:sz="4"/>
-          <w:insideV w:val="single" w:color="BFBFBF" w:sz="4"/>
+          <w:top w:val="single" w:color="000000" w:sz="4"/>
+          <w:left w:val="single" w:color="000000" w:sz="4"/>
+          <w:bottom w:val="single" w:color="000000" w:sz="4"/>
+          <w:right w:val="single" w:color="000000" w:sz="4"/>
+          <w:insideH w:val="single" w:color="000000" w:sz="4"/>
+          <w:insideV w:val="single" w:color="000000" w:sz="4"/>
         </w:tblBorders>
         <w:tblLayout w:type="fixed"/>
       </w:tblPr>
@@ -3931,7 +3804,6 @@
         <w:tc>
           <w:tcPr>
             <w:tcW w:type="dxa" w:w="3760"/>
-            <w:shd w:fill="1F3864" w:color="auto" w:val="clear"/>
             <w:tcMar>
               <w:top w:type="dxa" w:w="60"/>
               <w:left w:type="dxa" w:w="110"/>
@@ -3952,7 +3824,7 @@
                 <w:rFonts w:ascii="Arial" w:cs="Arial" w:eastAsia="Arial" w:hAnsi="Arial"/>
                 <w:b/>
                 <w:bCs/>
-                <w:color w:val="FFFFFF"/>
+                <w:color w:val="000000"/>
                 <w:sz w:val="20"/>
                 <w:szCs w:val="20"/>
               </w:rPr>
@@ -3963,7 +3835,6 @@
         <w:tc>
           <w:tcPr>
             <w:tcW w:type="dxa" w:w="1900"/>
-            <w:shd w:fill="1F3864" w:color="auto" w:val="clear"/>
             <w:tcMar>
               <w:top w:type="dxa" w:w="60"/>
               <w:left w:type="dxa" w:w="110"/>
@@ -3984,7 +3855,7 @@
                 <w:rFonts w:ascii="Arial" w:cs="Arial" w:eastAsia="Arial" w:hAnsi="Arial"/>
                 <w:b/>
                 <w:bCs/>
-                <w:color w:val="FFFFFF"/>
+                <w:color w:val="000000"/>
                 <w:sz w:val="20"/>
                 <w:szCs w:val="20"/>
               </w:rPr>
@@ -3995,7 +3866,6 @@
         <w:tc>
           <w:tcPr>
             <w:tcW w:type="dxa" w:w="1800"/>
-            <w:shd w:fill="1F3864" w:color="auto" w:val="clear"/>
             <w:tcMar>
               <w:top w:type="dxa" w:w="60"/>
               <w:left w:type="dxa" w:w="110"/>
@@ -4016,7 +3886,7 @@
                 <w:rFonts w:ascii="Arial" w:cs="Arial" w:eastAsia="Arial" w:hAnsi="Arial"/>
                 <w:b/>
                 <w:bCs/>
-                <w:color w:val="FFFFFF"/>
+                <w:color w:val="000000"/>
                 <w:sz w:val="20"/>
                 <w:szCs w:val="20"/>
               </w:rPr>
@@ -4027,7 +3897,6 @@
         <w:tc>
           <w:tcPr>
             <w:tcW w:type="dxa" w:w="1900"/>
-            <w:shd w:fill="1F3864" w:color="auto" w:val="clear"/>
             <w:tcMar>
               <w:top w:type="dxa" w:w="60"/>
               <w:left w:type="dxa" w:w="110"/>
@@ -4048,7 +3917,7 @@
                 <w:rFonts w:ascii="Arial" w:cs="Arial" w:eastAsia="Arial" w:hAnsi="Arial"/>
                 <w:b/>
                 <w:bCs/>
-                <w:color w:val="FFFFFF"/>
+                <w:color w:val="000000"/>
                 <w:sz w:val="20"/>
                 <w:szCs w:val="20"/>
               </w:rPr>
@@ -4083,6 +3952,7 @@
             <w:r>
               <w:rPr>
                 <w:rFonts w:ascii="Arial" w:cs="Arial" w:eastAsia="Arial" w:hAnsi="Arial"/>
+                <w:color w:val="000000"/>
                 <w:sz w:val="20"/>
                 <w:szCs w:val="20"/>
               </w:rPr>
@@ -4111,6 +3981,7 @@
             <w:r>
               <w:rPr>
                 <w:rFonts w:ascii="Arial" w:cs="Arial" w:eastAsia="Arial" w:hAnsi="Arial"/>
+                <w:color w:val="000000"/>
                 <w:sz w:val="20"/>
                 <w:szCs w:val="20"/>
               </w:rPr>
@@ -4139,6 +4010,7 @@
             <w:r>
               <w:rPr>
                 <w:rFonts w:ascii="Arial" w:cs="Arial" w:eastAsia="Arial" w:hAnsi="Arial"/>
+                <w:color w:val="000000"/>
                 <w:sz w:val="20"/>
                 <w:szCs w:val="20"/>
               </w:rPr>
@@ -4167,6 +4039,7 @@
             <w:r>
               <w:rPr>
                 <w:rFonts w:ascii="Arial" w:cs="Arial" w:eastAsia="Arial" w:hAnsi="Arial"/>
+                <w:color w:val="000000"/>
                 <w:sz w:val="20"/>
                 <w:szCs w:val="20"/>
               </w:rPr>
@@ -4201,6 +4074,7 @@
             <w:r>
               <w:rPr>
                 <w:rFonts w:ascii="Arial" w:cs="Arial" w:eastAsia="Arial" w:hAnsi="Arial"/>
+                <w:color w:val="000000"/>
                 <w:sz w:val="20"/>
                 <w:szCs w:val="20"/>
               </w:rPr>
@@ -4229,6 +4103,7 @@
             <w:r>
               <w:rPr>
                 <w:rFonts w:ascii="Arial" w:cs="Arial" w:eastAsia="Arial" w:hAnsi="Arial"/>
+                <w:color w:val="000000"/>
                 <w:sz w:val="20"/>
                 <w:szCs w:val="20"/>
               </w:rPr>
@@ -4257,6 +4132,7 @@
             <w:r>
               <w:rPr>
                 <w:rFonts w:ascii="Arial" w:cs="Arial" w:eastAsia="Arial" w:hAnsi="Arial"/>
+                <w:color w:val="000000"/>
                 <w:sz w:val="20"/>
                 <w:szCs w:val="20"/>
               </w:rPr>
@@ -4285,6 +4161,7 @@
             <w:r>
               <w:rPr>
                 <w:rFonts w:ascii="Arial" w:cs="Arial" w:eastAsia="Arial" w:hAnsi="Arial"/>
+                <w:color w:val="000000"/>
                 <w:sz w:val="20"/>
                 <w:szCs w:val="20"/>
               </w:rPr>
@@ -4301,11 +4178,6 @@
         <w:tc>
           <w:tcPr>
             <w:tcW w:type="dxa" w:w="3760"/>
-            <w:tcBorders>
-              <w:top w:val="single" w:color="000000" w:sz="8"/>
-              <w:bottom w:val="double" w:color="000000" w:sz="6"/>
-            </w:tcBorders>
-            <w:shd w:fill="F2F2F2" w:color="auto" w:val="clear"/>
             <w:tcMar>
               <w:top w:type="dxa" w:w="60"/>
               <w:left w:type="dxa" w:w="110"/>
@@ -4326,6 +4198,7 @@
                 <w:rFonts w:ascii="Arial" w:cs="Arial" w:eastAsia="Arial" w:hAnsi="Arial"/>
                 <w:b/>
                 <w:bCs/>
+                <w:color w:val="000000"/>
                 <w:sz w:val="20"/>
                 <w:szCs w:val="20"/>
               </w:rPr>
@@ -4336,11 +4209,6 @@
         <w:tc>
           <w:tcPr>
             <w:tcW w:type="dxa" w:w="1900"/>
-            <w:tcBorders>
-              <w:top w:val="single" w:color="000000" w:sz="8"/>
-              <w:bottom w:val="double" w:color="000000" w:sz="6"/>
-            </w:tcBorders>
-            <w:shd w:fill="F2F2F2" w:color="auto" w:val="clear"/>
             <w:tcMar>
               <w:top w:type="dxa" w:w="60"/>
               <w:left w:type="dxa" w:w="110"/>
@@ -4361,6 +4229,7 @@
                 <w:rFonts w:ascii="Arial" w:cs="Arial" w:eastAsia="Arial" w:hAnsi="Arial"/>
                 <w:b/>
                 <w:bCs/>
+                <w:color w:val="000000"/>
                 <w:sz w:val="20"/>
                 <w:szCs w:val="20"/>
               </w:rPr>
@@ -4371,11 +4240,6 @@
         <w:tc>
           <w:tcPr>
             <w:tcW w:type="dxa" w:w="1800"/>
-            <w:tcBorders>
-              <w:top w:val="single" w:color="000000" w:sz="8"/>
-              <w:bottom w:val="double" w:color="000000" w:sz="6"/>
-            </w:tcBorders>
-            <w:shd w:fill="F2F2F2" w:color="auto" w:val="clear"/>
             <w:tcMar>
               <w:top w:type="dxa" w:w="60"/>
               <w:left w:type="dxa" w:w="110"/>
@@ -4396,6 +4260,7 @@
                 <w:rFonts w:ascii="Arial" w:cs="Arial" w:eastAsia="Arial" w:hAnsi="Arial"/>
                 <w:b/>
                 <w:bCs/>
+                <w:color w:val="000000"/>
                 <w:sz w:val="20"/>
                 <w:szCs w:val="20"/>
               </w:rPr>
@@ -4406,11 +4271,6 @@
         <w:tc>
           <w:tcPr>
             <w:tcW w:type="dxa" w:w="1900"/>
-            <w:tcBorders>
-              <w:top w:val="single" w:color="000000" w:sz="8"/>
-              <w:bottom w:val="double" w:color="000000" w:sz="6"/>
-            </w:tcBorders>
-            <w:shd w:fill="F2F2F2" w:color="auto" w:val="clear"/>
             <w:tcMar>
               <w:top w:type="dxa" w:w="60"/>
               <w:left w:type="dxa" w:w="110"/>
@@ -4431,6 +4291,7 @@
                 <w:rFonts w:ascii="Arial" w:cs="Arial" w:eastAsia="Arial" w:hAnsi="Arial"/>
                 <w:b/>
                 <w:bCs/>
+                <w:color w:val="000000"/>
                 <w:sz w:val="20"/>
                 <w:szCs w:val="20"/>
               </w:rPr>
@@ -4451,6 +4312,7 @@
       <w:r>
         <w:rPr>
           <w:rFonts w:ascii="Arial" w:cs="Arial" w:eastAsia="Arial" w:hAnsi="Arial"/>
+          <w:color w:val="000000"/>
           <w:sz w:val="22"/>
           <w:szCs w:val="22"/>
         </w:rPr>
@@ -4468,6 +4330,7 @@
       <w:r>
         <w:rPr>
           <w:rFonts w:ascii="Arial" w:cs="Arial" w:eastAsia="Arial" w:hAnsi="Arial"/>
+          <w:color w:val="000000"/>
           <w:sz w:val="22"/>
           <w:szCs w:val="22"/>
         </w:rPr>
@@ -4487,6 +4350,7 @@
           <w:rFonts w:ascii="Arial" w:cs="Arial" w:eastAsia="Arial" w:hAnsi="Arial"/>
           <w:b/>
           <w:bCs/>
+          <w:color w:val="000000"/>
           <w:sz w:val="22"/>
           <w:szCs w:val="22"/>
         </w:rPr>
@@ -4501,6 +4365,7 @@
       <w:r>
         <w:rPr>
           <w:rFonts w:ascii="Arial" w:cs="Arial" w:eastAsia="Arial" w:hAnsi="Arial"/>
+          <w:color w:val="000000"/>
           <w:sz w:val="22"/>
           <w:szCs w:val="22"/>
         </w:rPr>
@@ -4516,33 +4381,27 @@
           <w:rFonts w:ascii="Arial" w:cs="Arial" w:eastAsia="Arial" w:hAnsi="Arial"/>
           <w:b/>
           <w:bCs/>
-          <w:color w:val="1F3864"/>
-          <w:sz w:val="28"/>
-          <w:szCs w:val="28"/>
-        </w:rPr>
-        <w:t xml:space="preserve">Question 6: Weighted average cost of capital (WACC)</w:t>
+          <w:color w:val="000000"/>
+          <w:sz w:val="26"/>
+          <w:szCs w:val="26"/>
+        </w:rPr>
+        <w:t xml:space="preserve">Question 6</w:t>
       </w:r>
     </w:p>
     <w:p>
       <w:pPr>
         <w:keepNext/>
         <w:keepLines/>
-        <w:pBdr>
-          <w:left w:val="single" w:color="1F3864" w:sz="18" w:space="8"/>
-        </w:pBdr>
-        <w:spacing w:after="200" w:before="0" w:line="276" w:lineRule="auto"/>
-        <w:ind w:left="200"/>
+        <w:spacing w:after="120" w:before="0" w:line="276" w:lineRule="auto"/>
       </w:pPr>
       <w:r>
         <w:rPr>
           <w:rFonts w:ascii="Arial" w:cs="Arial" w:eastAsia="Arial" w:hAnsi="Arial"/>
-          <w:i/>
-          <w:iCs/>
-          <w:color w:val="595959"/>
-          <w:sz w:val="20"/>
-          <w:szCs w:val="20"/>
-        </w:rPr>
-        <w:t xml:space="preserve">Calculate the weighted average cost of capital (WACC).</w:t>
+          <w:color w:val="000000"/>
+          <w:sz w:val="22"/>
+          <w:szCs w:val="22"/>
+        </w:rPr>
+        <w:t xml:space="preserve">The weighted average cost of capital is calculated as:</w:t>
       </w:r>
     </w:p>
     <w:p>
@@ -4557,6 +4416,7 @@
           <w:rFonts w:ascii="Arial" w:cs="Arial" w:eastAsia="Arial" w:hAnsi="Arial"/>
           <w:b/>
           <w:bCs/>
+          <w:color w:val="000000"/>
           <w:sz w:val="22"/>
           <w:szCs w:val="22"/>
         </w:rPr>
@@ -4567,6 +4427,7 @@
           <w:rFonts w:ascii="Arial" w:cs="Arial" w:eastAsia="Arial" w:hAnsi="Arial"/>
           <w:b/>
           <w:bCs/>
+          <w:color w:val="000000"/>
           <w:sz w:val="22"/>
           <w:szCs w:val="22"/>
           <w:vertAlign w:val="subscript"/>
@@ -4578,6 +4439,7 @@
           <w:rFonts w:ascii="Arial" w:cs="Arial" w:eastAsia="Arial" w:hAnsi="Arial"/>
           <w:b/>
           <w:bCs/>
+          <w:color w:val="000000"/>
           <w:sz w:val="22"/>
           <w:szCs w:val="22"/>
         </w:rPr>
@@ -4588,6 +4450,7 @@
           <w:rFonts w:ascii="Arial" w:cs="Arial" w:eastAsia="Arial" w:hAnsi="Arial"/>
           <w:b/>
           <w:bCs/>
+          <w:color w:val="000000"/>
           <w:sz w:val="22"/>
           <w:szCs w:val="22"/>
           <w:vertAlign w:val="subscript"/>
@@ -4599,6 +4462,7 @@
           <w:rFonts w:ascii="Arial" w:cs="Arial" w:eastAsia="Arial" w:hAnsi="Arial"/>
           <w:b/>
           <w:bCs/>
+          <w:color w:val="000000"/>
           <w:sz w:val="22"/>
           <w:szCs w:val="22"/>
         </w:rPr>
@@ -4609,6 +4473,7 @@
           <w:rFonts w:ascii="Arial" w:cs="Arial" w:eastAsia="Arial" w:hAnsi="Arial"/>
           <w:b/>
           <w:bCs/>
+          <w:color w:val="000000"/>
           <w:sz w:val="22"/>
           <w:szCs w:val="22"/>
           <w:vertAlign w:val="subscript"/>
@@ -4620,6 +4485,7 @@
           <w:rFonts w:ascii="Arial" w:cs="Arial" w:eastAsia="Arial" w:hAnsi="Arial"/>
           <w:b/>
           <w:bCs/>
+          <w:color w:val="000000"/>
           <w:sz w:val="22"/>
           <w:szCs w:val="22"/>
         </w:rPr>
@@ -4630,6 +4496,7 @@
           <w:rFonts w:ascii="Arial" w:cs="Arial" w:eastAsia="Arial" w:hAnsi="Arial"/>
           <w:b/>
           <w:bCs/>
+          <w:color w:val="000000"/>
           <w:sz w:val="22"/>
           <w:szCs w:val="22"/>
           <w:vertAlign w:val="subscript"/>
@@ -4641,6 +4508,7 @@
           <w:rFonts w:ascii="Arial" w:cs="Arial" w:eastAsia="Arial" w:hAnsi="Arial"/>
           <w:b/>
           <w:bCs/>
+          <w:color w:val="000000"/>
           <w:sz w:val="22"/>
           <w:szCs w:val="22"/>
         </w:rPr>
@@ -4658,7 +4526,7 @@
           <w:rFonts w:ascii="Arial" w:cs="Arial" w:eastAsia="Arial" w:hAnsi="Arial"/>
           <w:b/>
           <w:bCs/>
-          <w:color w:val="1F3864"/>
+          <w:color w:val="000000"/>
           <w:sz w:val="20"/>
           <w:szCs w:val="20"/>
         </w:rPr>
@@ -4669,12 +4537,12 @@
       <w:tblPr>
         <w:tblW w:type="dxa" w:w="9360"/>
         <w:tblBorders>
-          <w:top w:val="single" w:color="BFBFBF" w:sz="4"/>
-          <w:left w:val="single" w:color="BFBFBF" w:sz="4"/>
-          <w:bottom w:val="single" w:color="BFBFBF" w:sz="4"/>
-          <w:right w:val="single" w:color="BFBFBF" w:sz="4"/>
-          <w:insideH w:val="single" w:color="BFBFBF" w:sz="4"/>
-          <w:insideV w:val="single" w:color="BFBFBF" w:sz="4"/>
+          <w:top w:val="single" w:color="000000" w:sz="4"/>
+          <w:left w:val="single" w:color="000000" w:sz="4"/>
+          <w:bottom w:val="single" w:color="000000" w:sz="4"/>
+          <w:right w:val="single" w:color="000000" w:sz="4"/>
+          <w:insideH w:val="single" w:color="000000" w:sz="4"/>
+          <w:insideV w:val="single" w:color="000000" w:sz="4"/>
         </w:tblBorders>
         <w:tblLayout w:type="fixed"/>
       </w:tblPr>
@@ -4692,7 +4560,6 @@
         <w:tc>
           <w:tcPr>
             <w:tcW w:type="dxa" w:w="1300"/>
-            <w:shd w:fill="1F3864" w:color="auto" w:val="clear"/>
             <w:tcMar>
               <w:top w:type="dxa" w:w="60"/>
               <w:left w:type="dxa" w:w="110"/>
@@ -4713,7 +4580,7 @@
                 <w:rFonts w:ascii="Arial" w:cs="Arial" w:eastAsia="Arial" w:hAnsi="Arial"/>
                 <w:b/>
                 <w:bCs/>
-                <w:color w:val="FFFFFF"/>
+                <w:color w:val="000000"/>
                 <w:sz w:val="20"/>
                 <w:szCs w:val="20"/>
               </w:rPr>
@@ -4724,7 +4591,6 @@
         <w:tc>
           <w:tcPr>
             <w:tcW w:type="dxa" w:w="3760"/>
-            <w:shd w:fill="1F3864" w:color="auto" w:val="clear"/>
             <w:tcMar>
               <w:top w:type="dxa" w:w="60"/>
               <w:left w:type="dxa" w:w="110"/>
@@ -4745,7 +4611,7 @@
                 <w:rFonts w:ascii="Arial" w:cs="Arial" w:eastAsia="Arial" w:hAnsi="Arial"/>
                 <w:b/>
                 <w:bCs/>
-                <w:color w:val="FFFFFF"/>
+                <w:color w:val="000000"/>
                 <w:sz w:val="20"/>
                 <w:szCs w:val="20"/>
               </w:rPr>
@@ -4756,7 +4622,6 @@
         <w:tc>
           <w:tcPr>
             <w:tcW w:type="dxa" w:w="1800"/>
-            <w:shd w:fill="1F3864" w:color="auto" w:val="clear"/>
             <w:tcMar>
               <w:top w:type="dxa" w:w="60"/>
               <w:left w:type="dxa" w:w="110"/>
@@ -4777,7 +4642,7 @@
                 <w:rFonts w:ascii="Arial" w:cs="Arial" w:eastAsia="Arial" w:hAnsi="Arial"/>
                 <w:b/>
                 <w:bCs/>
-                <w:color w:val="FFFFFF"/>
+                <w:color w:val="000000"/>
                 <w:sz w:val="20"/>
                 <w:szCs w:val="20"/>
               </w:rPr>
@@ -4788,7 +4653,6 @@
         <w:tc>
           <w:tcPr>
             <w:tcW w:type="dxa" w:w="2500"/>
-            <w:shd w:fill="1F3864" w:color="auto" w:val="clear"/>
             <w:tcMar>
               <w:top w:type="dxa" w:w="60"/>
               <w:left w:type="dxa" w:w="110"/>
@@ -4809,7 +4673,7 @@
                 <w:rFonts w:ascii="Arial" w:cs="Arial" w:eastAsia="Arial" w:hAnsi="Arial"/>
                 <w:b/>
                 <w:bCs/>
-                <w:color w:val="FFFFFF"/>
+                <w:color w:val="000000"/>
                 <w:sz w:val="20"/>
                 <w:szCs w:val="20"/>
               </w:rPr>
@@ -4844,6 +4708,7 @@
             <w:r>
               <w:rPr>
                 <w:rFonts w:ascii="Arial" w:cs="Arial" w:eastAsia="Arial" w:hAnsi="Arial"/>
+                <w:color w:val="000000"/>
                 <w:sz w:val="20"/>
                 <w:szCs w:val="20"/>
               </w:rPr>
@@ -4852,6 +4717,7 @@
             <w:r>
               <w:rPr>
                 <w:rFonts w:ascii="Arial" w:cs="Arial" w:eastAsia="Arial" w:hAnsi="Arial"/>
+                <w:color w:val="000000"/>
                 <w:sz w:val="20"/>
                 <w:szCs w:val="20"/>
                 <w:vertAlign w:val="subscript"/>
@@ -4881,6 +4747,7 @@
             <w:r>
               <w:rPr>
                 <w:rFonts w:ascii="Arial" w:cs="Arial" w:eastAsia="Arial" w:hAnsi="Arial"/>
+                <w:color w:val="000000"/>
                 <w:sz w:val="20"/>
                 <w:szCs w:val="20"/>
               </w:rPr>
@@ -4909,6 +4776,7 @@
             <w:r>
               <w:rPr>
                 <w:rFonts w:ascii="Arial" w:cs="Arial" w:eastAsia="Arial" w:hAnsi="Arial"/>
+                <w:color w:val="000000"/>
                 <w:sz w:val="20"/>
                 <w:szCs w:val="20"/>
               </w:rPr>
@@ -4937,6 +4805,7 @@
             <w:r>
               <w:rPr>
                 <w:rFonts w:ascii="Arial" w:cs="Arial" w:eastAsia="Arial" w:hAnsi="Arial"/>
+                <w:color w:val="000000"/>
                 <w:sz w:val="20"/>
                 <w:szCs w:val="20"/>
               </w:rPr>
@@ -4971,6 +4840,7 @@
             <w:r>
               <w:rPr>
                 <w:rFonts w:ascii="Arial" w:cs="Arial" w:eastAsia="Arial" w:hAnsi="Arial"/>
+                <w:color w:val="000000"/>
                 <w:sz w:val="20"/>
                 <w:szCs w:val="20"/>
               </w:rPr>
@@ -4979,6 +4849,7 @@
             <w:r>
               <w:rPr>
                 <w:rFonts w:ascii="Arial" w:cs="Arial" w:eastAsia="Arial" w:hAnsi="Arial"/>
+                <w:color w:val="000000"/>
                 <w:sz w:val="20"/>
                 <w:szCs w:val="20"/>
                 <w:vertAlign w:val="subscript"/>
@@ -5008,6 +4879,7 @@
             <w:r>
               <w:rPr>
                 <w:rFonts w:ascii="Arial" w:cs="Arial" w:eastAsia="Arial" w:hAnsi="Arial"/>
+                <w:color w:val="000000"/>
                 <w:sz w:val="20"/>
                 <w:szCs w:val="20"/>
               </w:rPr>
@@ -5036,6 +4908,7 @@
             <w:r>
               <w:rPr>
                 <w:rFonts w:ascii="Arial" w:cs="Arial" w:eastAsia="Arial" w:hAnsi="Arial"/>
+                <w:color w:val="000000"/>
                 <w:sz w:val="20"/>
                 <w:szCs w:val="20"/>
               </w:rPr>
@@ -5064,6 +4937,7 @@
             <w:r>
               <w:rPr>
                 <w:rFonts w:ascii="Arial" w:cs="Arial" w:eastAsia="Arial" w:hAnsi="Arial"/>
+                <w:color w:val="000000"/>
                 <w:sz w:val="20"/>
                 <w:szCs w:val="20"/>
               </w:rPr>
@@ -5098,6 +4972,7 @@
             <w:r>
               <w:rPr>
                 <w:rFonts w:ascii="Arial" w:cs="Arial" w:eastAsia="Arial" w:hAnsi="Arial"/>
+                <w:color w:val="000000"/>
                 <w:sz w:val="20"/>
                 <w:szCs w:val="20"/>
               </w:rPr>
@@ -5106,6 +4981,7 @@
             <w:r>
               <w:rPr>
                 <w:rFonts w:ascii="Arial" w:cs="Arial" w:eastAsia="Arial" w:hAnsi="Arial"/>
+                <w:color w:val="000000"/>
                 <w:sz w:val="20"/>
                 <w:szCs w:val="20"/>
                 <w:vertAlign w:val="subscript"/>
@@ -5135,6 +5011,7 @@
             <w:r>
               <w:rPr>
                 <w:rFonts w:ascii="Arial" w:cs="Arial" w:eastAsia="Arial" w:hAnsi="Arial"/>
+                <w:color w:val="000000"/>
                 <w:sz w:val="20"/>
                 <w:szCs w:val="20"/>
               </w:rPr>
@@ -5163,6 +5040,7 @@
             <w:r>
               <w:rPr>
                 <w:rFonts w:ascii="Arial" w:cs="Arial" w:eastAsia="Arial" w:hAnsi="Arial"/>
+                <w:color w:val="000000"/>
                 <w:sz w:val="20"/>
                 <w:szCs w:val="20"/>
               </w:rPr>
@@ -5191,6 +5069,7 @@
             <w:r>
               <w:rPr>
                 <w:rFonts w:ascii="Arial" w:cs="Arial" w:eastAsia="Arial" w:hAnsi="Arial"/>
+                <w:color w:val="000000"/>
                 <w:sz w:val="20"/>
                 <w:szCs w:val="20"/>
               </w:rPr>
@@ -5225,6 +5104,7 @@
             <w:r>
               <w:rPr>
                 <w:rFonts w:ascii="Arial" w:cs="Arial" w:eastAsia="Arial" w:hAnsi="Arial"/>
+                <w:color w:val="000000"/>
                 <w:sz w:val="20"/>
                 <w:szCs w:val="20"/>
               </w:rPr>
@@ -5233,6 +5113,7 @@
             <w:r>
               <w:rPr>
                 <w:rFonts w:ascii="Arial" w:cs="Arial" w:eastAsia="Arial" w:hAnsi="Arial"/>
+                <w:color w:val="000000"/>
                 <w:sz w:val="20"/>
                 <w:szCs w:val="20"/>
                 <w:vertAlign w:val="subscript"/>
@@ -5262,6 +5143,7 @@
             <w:r>
               <w:rPr>
                 <w:rFonts w:ascii="Arial" w:cs="Arial" w:eastAsia="Arial" w:hAnsi="Arial"/>
+                <w:color w:val="000000"/>
                 <w:sz w:val="20"/>
                 <w:szCs w:val="20"/>
               </w:rPr>
@@ -5290,6 +5172,7 @@
             <w:r>
               <w:rPr>
                 <w:rFonts w:ascii="Arial" w:cs="Arial" w:eastAsia="Arial" w:hAnsi="Arial"/>
+                <w:color w:val="000000"/>
                 <w:sz w:val="20"/>
                 <w:szCs w:val="20"/>
               </w:rPr>
@@ -5318,6 +5201,7 @@
             <w:r>
               <w:rPr>
                 <w:rFonts w:ascii="Arial" w:cs="Arial" w:eastAsia="Arial" w:hAnsi="Arial"/>
+                <w:color w:val="000000"/>
                 <w:sz w:val="20"/>
                 <w:szCs w:val="20"/>
               </w:rPr>
@@ -5352,6 +5236,7 @@
             <w:r>
               <w:rPr>
                 <w:rFonts w:ascii="Arial" w:cs="Arial" w:eastAsia="Arial" w:hAnsi="Arial"/>
+                <w:color w:val="000000"/>
                 <w:sz w:val="20"/>
                 <w:szCs w:val="20"/>
               </w:rPr>
@@ -5380,6 +5265,7 @@
             <w:r>
               <w:rPr>
                 <w:rFonts w:ascii="Arial" w:cs="Arial" w:eastAsia="Arial" w:hAnsi="Arial"/>
+                <w:color w:val="000000"/>
                 <w:sz w:val="20"/>
                 <w:szCs w:val="20"/>
               </w:rPr>
@@ -5408,6 +5294,7 @@
             <w:r>
               <w:rPr>
                 <w:rFonts w:ascii="Arial" w:cs="Arial" w:eastAsia="Arial" w:hAnsi="Arial"/>
+                <w:color w:val="000000"/>
                 <w:sz w:val="20"/>
                 <w:szCs w:val="20"/>
               </w:rPr>
@@ -5436,6 +5323,7 @@
             <w:r>
               <w:rPr>
                 <w:rFonts w:ascii="Arial" w:cs="Arial" w:eastAsia="Arial" w:hAnsi="Arial"/>
+                <w:color w:val="000000"/>
                 <w:sz w:val="20"/>
                 <w:szCs w:val="20"/>
               </w:rPr>
@@ -5456,6 +5344,7 @@
       <w:r>
         <w:rPr>
           <w:rFonts w:ascii="Arial" w:cs="Arial" w:eastAsia="Arial" w:hAnsi="Arial"/>
+          <w:color w:val="000000"/>
           <w:sz w:val="22"/>
           <w:szCs w:val="22"/>
         </w:rPr>
@@ -5473,6 +5362,7 @@
       <w:r>
         <w:rPr>
           <w:rFonts w:ascii="Arial" w:cs="Arial" w:eastAsia="Arial" w:hAnsi="Arial"/>
+          <w:color w:val="000000"/>
           <w:sz w:val="22"/>
           <w:szCs w:val="22"/>
         </w:rPr>
@@ -5492,6 +5382,7 @@
           <w:rFonts w:ascii="Arial" w:cs="Arial" w:eastAsia="Arial" w:hAnsi="Arial"/>
           <w:b/>
           <w:bCs/>
+          <w:color w:val="000000"/>
           <w:sz w:val="22"/>
           <w:szCs w:val="22"/>
         </w:rPr>
@@ -5509,7 +5400,7 @@
           <w:rFonts w:ascii="Arial" w:cs="Arial" w:eastAsia="Arial" w:hAnsi="Arial"/>
           <w:b/>
           <w:bCs/>
-          <w:color w:val="1F3864"/>
+          <w:color w:val="000000"/>
           <w:sz w:val="20"/>
           <w:szCs w:val="20"/>
         </w:rPr>
@@ -5520,12 +5411,12 @@
       <w:tblPr>
         <w:tblW w:type="dxa" w:w="9360"/>
         <w:tblBorders>
-          <w:top w:val="single" w:color="BFBFBF" w:sz="4"/>
-          <w:left w:val="single" w:color="BFBFBF" w:sz="4"/>
-          <w:bottom w:val="single" w:color="BFBFBF" w:sz="4"/>
-          <w:right w:val="single" w:color="BFBFBF" w:sz="4"/>
-          <w:insideH w:val="single" w:color="BFBFBF" w:sz="4"/>
-          <w:insideV w:val="single" w:color="BFBFBF" w:sz="4"/>
+          <w:top w:val="single" w:color="000000" w:sz="4"/>
+          <w:left w:val="single" w:color="000000" w:sz="4"/>
+          <w:bottom w:val="single" w:color="000000" w:sz="4"/>
+          <w:right w:val="single" w:color="000000" w:sz="4"/>
+          <w:insideH w:val="single" w:color="000000" w:sz="4"/>
+          <w:insideV w:val="single" w:color="000000" w:sz="4"/>
         </w:tblBorders>
         <w:tblLayout w:type="fixed"/>
       </w:tblPr>
@@ -5543,7 +5434,6 @@
         <w:tc>
           <w:tcPr>
             <w:tcW w:type="dxa" w:w="2860"/>
-            <w:shd w:fill="1F3864" w:color="auto" w:val="clear"/>
             <w:tcMar>
               <w:top w:type="dxa" w:w="60"/>
               <w:left w:type="dxa" w:w="110"/>
@@ -5564,7 +5454,7 @@
                 <w:rFonts w:ascii="Arial" w:cs="Arial" w:eastAsia="Arial" w:hAnsi="Arial"/>
                 <w:b/>
                 <w:bCs/>
-                <w:color w:val="FFFFFF"/>
+                <w:color w:val="000000"/>
                 <w:sz w:val="20"/>
                 <w:szCs w:val="20"/>
               </w:rPr>
@@ -5575,7 +5465,6 @@
         <w:tc>
           <w:tcPr>
             <w:tcW w:type="dxa" w:w="2000"/>
-            <w:shd w:fill="1F3864" w:color="auto" w:val="clear"/>
             <w:tcMar>
               <w:top w:type="dxa" w:w="60"/>
               <w:left w:type="dxa" w:w="110"/>
@@ -5596,7 +5485,7 @@
                 <w:rFonts w:ascii="Arial" w:cs="Arial" w:eastAsia="Arial" w:hAnsi="Arial"/>
                 <w:b/>
                 <w:bCs/>
-                <w:color w:val="FFFFFF"/>
+                <w:color w:val="000000"/>
                 <w:sz w:val="20"/>
                 <w:szCs w:val="20"/>
               </w:rPr>
@@ -5607,7 +5496,6 @@
         <w:tc>
           <w:tcPr>
             <w:tcW w:type="dxa" w:w="2250"/>
-            <w:shd w:fill="1F3864" w:color="auto" w:val="clear"/>
             <w:tcMar>
               <w:top w:type="dxa" w:w="60"/>
               <w:left w:type="dxa" w:w="110"/>
@@ -5628,7 +5516,7 @@
                 <w:rFonts w:ascii="Arial" w:cs="Arial" w:eastAsia="Arial" w:hAnsi="Arial"/>
                 <w:b/>
                 <w:bCs/>
-                <w:color w:val="FFFFFF"/>
+                <w:color w:val="000000"/>
                 <w:sz w:val="20"/>
                 <w:szCs w:val="20"/>
               </w:rPr>
@@ -5639,7 +5527,6 @@
         <w:tc>
           <w:tcPr>
             <w:tcW w:type="dxa" w:w="2250"/>
-            <w:shd w:fill="1F3864" w:color="auto" w:val="clear"/>
             <w:tcMar>
               <w:top w:type="dxa" w:w="60"/>
               <w:left w:type="dxa" w:w="110"/>
@@ -5660,7 +5547,7 @@
                 <w:rFonts w:ascii="Arial" w:cs="Arial" w:eastAsia="Arial" w:hAnsi="Arial"/>
                 <w:b/>
                 <w:bCs/>
-                <w:color w:val="FFFFFF"/>
+                <w:color w:val="000000"/>
                 <w:sz w:val="20"/>
                 <w:szCs w:val="20"/>
               </w:rPr>
@@ -5695,6 +5582,7 @@
             <w:r>
               <w:rPr>
                 <w:rFonts w:ascii="Arial" w:cs="Arial" w:eastAsia="Arial" w:hAnsi="Arial"/>
+                <w:color w:val="000000"/>
                 <w:sz w:val="20"/>
                 <w:szCs w:val="20"/>
               </w:rPr>
@@ -5723,6 +5611,7 @@
             <w:r>
               <w:rPr>
                 <w:rFonts w:ascii="Arial" w:cs="Arial" w:eastAsia="Arial" w:hAnsi="Arial"/>
+                <w:color w:val="000000"/>
                 <w:sz w:val="20"/>
                 <w:szCs w:val="20"/>
               </w:rPr>
@@ -5751,6 +5640,7 @@
             <w:r>
               <w:rPr>
                 <w:rFonts w:ascii="Arial" w:cs="Arial" w:eastAsia="Arial" w:hAnsi="Arial"/>
+                <w:color w:val="000000"/>
                 <w:sz w:val="20"/>
                 <w:szCs w:val="20"/>
               </w:rPr>
@@ -5779,6 +5669,7 @@
             <w:r>
               <w:rPr>
                 <w:rFonts w:ascii="Arial" w:cs="Arial" w:eastAsia="Arial" w:hAnsi="Arial"/>
+                <w:color w:val="000000"/>
                 <w:sz w:val="20"/>
                 <w:szCs w:val="20"/>
               </w:rPr>
@@ -5813,6 +5704,7 @@
             <w:r>
               <w:rPr>
                 <w:rFonts w:ascii="Arial" w:cs="Arial" w:eastAsia="Arial" w:hAnsi="Arial"/>
+                <w:color w:val="000000"/>
                 <w:sz w:val="20"/>
                 <w:szCs w:val="20"/>
               </w:rPr>
@@ -5841,6 +5733,7 @@
             <w:r>
               <w:rPr>
                 <w:rFonts w:ascii="Arial" w:cs="Arial" w:eastAsia="Arial" w:hAnsi="Arial"/>
+                <w:color w:val="000000"/>
                 <w:sz w:val="20"/>
                 <w:szCs w:val="20"/>
               </w:rPr>
@@ -5869,6 +5762,7 @@
             <w:r>
               <w:rPr>
                 <w:rFonts w:ascii="Arial" w:cs="Arial" w:eastAsia="Arial" w:hAnsi="Arial"/>
+                <w:color w:val="000000"/>
                 <w:sz w:val="20"/>
                 <w:szCs w:val="20"/>
               </w:rPr>
@@ -5897,6 +5791,7 @@
             <w:r>
               <w:rPr>
                 <w:rFonts w:ascii="Arial" w:cs="Arial" w:eastAsia="Arial" w:hAnsi="Arial"/>
+                <w:color w:val="000000"/>
                 <w:sz w:val="20"/>
                 <w:szCs w:val="20"/>
               </w:rPr>
@@ -5913,11 +5808,6 @@
         <w:tc>
           <w:tcPr>
             <w:tcW w:type="dxa" w:w="2860"/>
-            <w:tcBorders>
-              <w:top w:val="single" w:color="000000" w:sz="8"/>
-              <w:bottom w:val="double" w:color="000000" w:sz="6"/>
-            </w:tcBorders>
-            <w:shd w:fill="F2F2F2" w:color="auto" w:val="clear"/>
             <w:tcMar>
               <w:top w:type="dxa" w:w="60"/>
               <w:left w:type="dxa" w:w="110"/>
@@ -5938,6 +5828,7 @@
                 <w:rFonts w:ascii="Arial" w:cs="Arial" w:eastAsia="Arial" w:hAnsi="Arial"/>
                 <w:b/>
                 <w:bCs/>
+                <w:color w:val="000000"/>
                 <w:sz w:val="20"/>
                 <w:szCs w:val="20"/>
               </w:rPr>
@@ -5948,11 +5839,6 @@
         <w:tc>
           <w:tcPr>
             <w:tcW w:type="dxa" w:w="2000"/>
-            <w:tcBorders>
-              <w:top w:val="single" w:color="000000" w:sz="8"/>
-              <w:bottom w:val="double" w:color="000000" w:sz="6"/>
-            </w:tcBorders>
-            <w:shd w:fill="F2F2F2" w:color="auto" w:val="clear"/>
             <w:tcMar>
               <w:top w:type="dxa" w:w="60"/>
               <w:left w:type="dxa" w:w="110"/>
@@ -5973,6 +5859,7 @@
                 <w:rFonts w:ascii="Arial" w:cs="Arial" w:eastAsia="Arial" w:hAnsi="Arial"/>
                 <w:b/>
                 <w:bCs/>
+                <w:color w:val="000000"/>
                 <w:sz w:val="20"/>
                 <w:szCs w:val="20"/>
               </w:rPr>
@@ -5983,11 +5870,6 @@
         <w:tc>
           <w:tcPr>
             <w:tcW w:type="dxa" w:w="2250"/>
-            <w:tcBorders>
-              <w:top w:val="single" w:color="000000" w:sz="8"/>
-              <w:bottom w:val="double" w:color="000000" w:sz="6"/>
-            </w:tcBorders>
-            <w:shd w:fill="F2F2F2" w:color="auto" w:val="clear"/>
             <w:tcMar>
               <w:top w:type="dxa" w:w="60"/>
               <w:left w:type="dxa" w:w="110"/>
@@ -6008,6 +5890,7 @@
                 <w:rFonts w:ascii="Arial" w:cs="Arial" w:eastAsia="Arial" w:hAnsi="Arial"/>
                 <w:b/>
                 <w:bCs/>
+                <w:color w:val="000000"/>
                 <w:sz w:val="20"/>
                 <w:szCs w:val="20"/>
               </w:rPr>
@@ -6018,11 +5901,6 @@
         <w:tc>
           <w:tcPr>
             <w:tcW w:type="dxa" w:w="2250"/>
-            <w:tcBorders>
-              <w:top w:val="single" w:color="000000" w:sz="8"/>
-              <w:bottom w:val="double" w:color="000000" w:sz="6"/>
-            </w:tcBorders>
-            <w:shd w:fill="F2F2F2" w:color="auto" w:val="clear"/>
             <w:tcMar>
               <w:top w:type="dxa" w:w="60"/>
               <w:left w:type="dxa" w:w="110"/>
@@ -6043,6 +5921,7 @@
                 <w:rFonts w:ascii="Arial" w:cs="Arial" w:eastAsia="Arial" w:hAnsi="Arial"/>
                 <w:b/>
                 <w:bCs/>
+                <w:color w:val="000000"/>
                 <w:sz w:val="20"/>
                 <w:szCs w:val="20"/>
               </w:rPr>
@@ -6060,6 +5939,7 @@
       <w:r>
         <w:rPr>
           <w:rFonts w:ascii="Arial" w:cs="Arial" w:eastAsia="Arial" w:hAnsi="Arial"/>
+          <w:color w:val="000000"/>
           <w:sz w:val="22"/>
           <w:szCs w:val="22"/>
         </w:rPr>
@@ -6075,33 +5955,11 @@
           <w:rFonts w:ascii="Arial" w:cs="Arial" w:eastAsia="Arial" w:hAnsi="Arial"/>
           <w:b/>
           <w:bCs/>
-          <w:color w:val="1F3864"/>
-          <w:sz w:val="28"/>
-          <w:szCs w:val="28"/>
-        </w:rPr>
-        <w:t xml:space="preserve">Question 7: Hurdle rate (MARR)</w:t>
-      </w:r>
-    </w:p>
-    <w:p>
-      <w:pPr>
-        <w:keepNext/>
-        <w:keepLines/>
-        <w:pBdr>
-          <w:left w:val="single" w:color="1F3864" w:sz="18" w:space="8"/>
-        </w:pBdr>
-        <w:spacing w:after="200" w:before="0" w:line="276" w:lineRule="auto"/>
-        <w:ind w:left="200"/>
-      </w:pPr>
-      <w:r>
-        <w:rPr>
-          <w:rFonts w:ascii="Arial" w:cs="Arial" w:eastAsia="Arial" w:hAnsi="Arial"/>
-          <w:i/>
-          <w:iCs/>
-          <w:color w:val="595959"/>
-          <w:sz w:val="20"/>
-          <w:szCs w:val="20"/>
-        </w:rPr>
-        <w:t xml:space="preserve">Ultimately Dale and Lee need to determine a hurdle rate or a Minimum Attractive Rate of Return (MARR). What should that value be and why?</w:t>
+          <w:color w:val="000000"/>
+          <w:sz w:val="26"/>
+          <w:szCs w:val="26"/>
+        </w:rPr>
+        <w:t xml:space="preserve">Question 7</w:t>
       </w:r>
     </w:p>
     <w:p>
@@ -6112,6 +5970,7 @@
       <w:r>
         <w:rPr>
           <w:rFonts w:ascii="Arial" w:cs="Arial" w:eastAsia="Arial" w:hAnsi="Arial"/>
+          <w:color w:val="000000"/>
           <w:sz w:val="22"/>
           <w:szCs w:val="22"/>
         </w:rPr>
@@ -6126,6 +5985,7 @@
       <w:r>
         <w:rPr>
           <w:rFonts w:ascii="Arial" w:cs="Arial" w:eastAsia="Arial" w:hAnsi="Arial"/>
+          <w:color w:val="000000"/>
           <w:sz w:val="22"/>
           <w:szCs w:val="22"/>
         </w:rPr>
@@ -6133,8 +5993,7 @@
       </w:r>
     </w:p>
     <w:sectPr>
-      <w:headerReference w:type="default" r:id="rId7"/>
-      <w:footerReference w:type="default" r:id="rId8"/>
+      <w:footerReference w:type="default" r:id="rId7"/>
       <w:pgSz w:w="12240" w:h="15840" w:orient="portrait"/>
       <w:pgMar w:top="1440" w:right="1440" w:bottom="1440" w:left="1440" w:header="708" w:footer="708" w:gutter="0"/>
       <w:pgNumType w:start="1" w:fmt="decimal"/>
@@ -6194,11 +6053,10 @@
     <w:r>
       <w:rPr>
         <w:rFonts w:ascii="Arial" w:cs="Arial" w:eastAsia="Arial" w:hAnsi="Arial"/>
-        <w:color w:val="595959"/>
-        <w:sz w:val="16"/>
-        <w:szCs w:val="16"/>
+        <w:color w:val="000000"/>
+        <w:sz w:val="20"/>
+        <w:szCs w:val="20"/>
       </w:rPr>
-      <w:t xml:space="preserve">Page </w:t>
       <w:fldChar w:fldCharType="begin"/>
       <w:instrText xml:space="preserve">PAGE</w:instrText>
       <w:fldChar w:fldCharType="separate"/>
@@ -6243,27 +6101,6 @@
     </w:p>
   </w:footnote>
 </w:footnotes>
-</file>
-
-<file path=word/header1.xml><?xml version="1.0" encoding="utf-8"?>
-<w:hdr xmlns:wpc="http://schemas.microsoft.com/office/word/2010/wordprocessingCanvas" xmlns:mc="http://schemas.openxmlformats.org/markup-compatibility/2006" xmlns:o="urn:schemas-microsoft-com:office:office" xmlns:r="http://schemas.openxmlformats.org/officeDocument/2006/relationships" xmlns:m="http://schemas.openxmlformats.org/officeDocument/2006/math" xmlns:v="urn:schemas-microsoft-com:vml" xmlns:wp14="http://schemas.microsoft.com/office/word/2010/wordprocessingDrawing" xmlns:wp="http://schemas.openxmlformats.org/drawingml/2006/wordprocessingDrawing" xmlns:w10="urn:schemas-microsoft-com:office:word" xmlns:w="http://schemas.openxmlformats.org/wordprocessingml/2006/main" xmlns:w14="http://schemas.microsoft.com/office/word/2010/wordml" xmlns:w15="http://schemas.microsoft.com/office/word/2012/wordml" xmlns:wpg="http://schemas.microsoft.com/office/word/2010/wordprocessingGroup" xmlns:wpi="http://schemas.microsoft.com/office/word/2010/wordprocessingInk" xmlns:wne="http://schemas.microsoft.com/office/word/2006/wordml" xmlns:wps="http://schemas.microsoft.com/office/word/2010/wordprocessingShape" xmlns:cx="http://schemas.microsoft.com/office/drawing/2014/chartex" xmlns:cx1="http://schemas.microsoft.com/office/drawing/2015/9/8/chartex" xmlns:cx2="http://schemas.microsoft.com/office/drawing/2015/10/21/chartex" xmlns:cx3="http://schemas.microsoft.com/office/drawing/2016/5/9/chartex" xmlns:cx4="http://schemas.microsoft.com/office/drawing/2016/5/10/chartex" xmlns:cx5="http://schemas.microsoft.com/office/drawing/2016/5/11/chartex" xmlns:cx6="http://schemas.microsoft.com/office/drawing/2016/5/12/chartex" xmlns:cx7="http://schemas.microsoft.com/office/drawing/2016/5/13/chartex" xmlns:cx8="http://schemas.microsoft.com/office/drawing/2016/5/14/chartex" xmlns:w16cid="http://schemas.microsoft.com/office/word/2016/wordml/cid" xmlns:w16se="http://schemas.microsoft.com/office/word/2015/wordml/symex">
-  <w:p>
-    <w:pPr>
-      <w:keepLines/>
-      <w:spacing w:after="0" w:before="0" w:line="276" w:lineRule="auto"/>
-      <w:jc w:val="right"/>
-    </w:pPr>
-    <w:r>
-      <w:rPr>
-        <w:rFonts w:ascii="Arial" w:cs="Arial" w:eastAsia="Arial" w:hAnsi="Arial"/>
-        <w:color w:val="595959"/>
-        <w:sz w:val="16"/>
-        <w:szCs w:val="16"/>
-      </w:rPr>
-      <w:t xml:space="preserve">Paolo Safady  |  Estimating Walmart's Cost of Capital</w:t>
-    </w:r>
-  </w:p>
-</w:hdr>
 </file>
 
 <file path=word/numbering.xml><?xml version="1.0" encoding="utf-8"?>
@@ -6367,6 +6204,7 @@
     <w:rPrDefault>
       <w:rPr>
         <w:rFonts w:ascii="Arial" w:cs="Arial" w:eastAsia="Arial" w:hAnsi="Arial"/>
+        <w:color w:val="000000"/>
         <w:sz w:val="22"/>
         <w:szCs w:val="22"/>
       </w:rPr>
@@ -6552,16 +6390,16 @@
     <w:pPr>
       <w:keepNext/>
       <w:keepLines/>
-      <w:spacing w:after="120" w:before="400"/>
+      <w:spacing w:after="120" w:before="360"/>
       <w:outlineLvl w:val="0"/>
     </w:pPr>
     <w:rPr>
       <w:rFonts w:ascii="Arial" w:cs="Arial" w:eastAsia="Arial" w:hAnsi="Arial"/>
       <w:b/>
       <w:bCs/>
-      <w:color w:val="1F3864"/>
-      <w:sz w:val="28"/>
-      <w:szCs w:val="28"/>
+      <w:color w:val="000000"/>
+      <w:sz w:val="26"/>
+      <w:szCs w:val="26"/>
     </w:rPr>
   </w:style>
 </w:styles>

</xml_diff>